<commit_message>
Bilingual product UI, live demo mode switch, demo video v2, replay reporting
- English / Simplified Chinese interface (signed content stays English and
  is translated at the UI boundary); product layout with step progress,
  formatted amounts, bank-style per-purchase approval cards, receipt
  timeline and attack cards that read real run results
- Streamlit Community Cloud entry point with a switch between scripted demo
  mode and live AI (access code or bring-your-own key; daily and per-session
  budget caps; isolated sessions); deployment guide in both languages
- Chinese README, re-captured screenshots, rebuilt deck and documents
- Strict offline replay on the current code: 142/142 verified, 141
  byte-identical, 1 documented schema migration (J01)
</commit_message>
<xml_diff>
--- a/docs/submission/execution-evidence.docx
+++ b/docs/submission/execution-evidence.docx
@@ -4,191 +4,123 @@
   <w:body>
     <w:p>
       <w:pPr>
-        <w:pStyle w:val="Subtitle"/>
+        <w:spacing w:after="80"/>
       </w:pPr>
       <w:r>
-        <w:t>2026 FINTECHATHON  INTERNATIONAL AI TRACK</w:t>
+        <w:rPr>
+          <w:rFonts w:ascii="Aptos" w:hAnsi="Aptos"/>
+          <w:b/>
+          <w:color w:val="315FD8"/>
+          <w:sz w:val="17"/>
+        </w:rPr>
+        <w:t>2026 FINTECHATHON · SUBMISSION TEMPLATE</w:t>
       </w:r>
     </w:p>
     <w:p>
       <w:pPr>
         <w:pStyle w:val="Title"/>
+        <w:spacing w:after="100"/>
       </w:pPr>
       <w:r>
+        <w:rPr>
+          <w:rFonts w:ascii="Arial" w:hAnsi="Arial"/>
+          <w:b/>
+          <w:color w:val="17213A"/>
+          <w:sz w:val="46"/>
+        </w:rPr>
         <w:t>Corridor Wealth Execution Evidence</w:t>
       </w:r>
     </w:p>
     <w:p>
       <w:pPr>
-        <w:pStyle w:val="Subtitle"/>
+        <w:spacing w:after="240"/>
       </w:pPr>
       <w:r>
-        <w:t>Topic B  Wealth Advisory Agent</w:t>
-      </w:r>
-    </w:p>
-    <w:p>
-      <w:r>
         <w:rPr>
-          <w:b w:val="0"/>
+          <w:rFonts w:ascii="Arial" w:hAnsi="Arial"/>
+          <w:color w:val="616C7F"/>
+          <w:sz w:val="20"/>
         </w:rPr>
-        <w:t xml:space="preserve">This document indexes final integrated evidence for International AI Track Topic B. </w:t>
-      </w:r>
-      <w:hyperlink r:id="rId10">
-        <w:r>
-          <w:rPr>
-            <w:color w:val="163B65"/>
-          </w:rPr>
-          <w:t>FINAL-RESULTS</w:t>
-        </w:r>
-      </w:hyperlink>
-      <w:r>
-        <w:rPr>
-          <w:b w:val="0"/>
-        </w:rPr>
-        <w:t xml:space="preserve"> records the authoritative outcomes, denominators, mode labels, failures and paths. A command or storyboard is not evidence that an experiment or filmed demonstration occurred.</w:t>
-      </w:r>
-    </w:p>
-    <w:p>
-      <w:pPr>
-        <w:pStyle w:val="Heading1"/>
-        <w:pageBreakBefore/>
-      </w:pPr>
-      <w:r>
-        <w:t>01 Evidence Summary</w:t>
-      </w:r>
-    </w:p>
-    <w:p>
-      <w:pPr>
-        <w:pStyle w:val="Heading2"/>
-      </w:pPr>
-      <w:r>
-        <w:t>Final measured results</w:t>
-      </w:r>
-    </w:p>
-    <w:p>
-      <w:r>
-        <w:rPr>
-          <w:b w:val="0"/>
-        </w:rPr>
-        <w:t xml:space="preserve">The values below are copied from </w:t>
-      </w:r>
-      <w:hyperlink r:id="rId10">
-        <w:r>
-          <w:rPr>
-            <w:color w:val="163B65"/>
-          </w:rPr>
-          <w:t>FINAL-RESULTS</w:t>
-        </w:r>
-      </w:hyperlink>
-      <w:r>
-        <w:rPr>
-          <w:b w:val="0"/>
-        </w:rPr>
-        <w:t xml:space="preserve"> and its </w:t>
-      </w:r>
-      <w:hyperlink r:id="rId11">
-        <w:r>
-          <w:rPr>
-            <w:color w:val="163B65"/>
-          </w:rPr>
-          <w:t>compact summary</w:t>
-        </w:r>
-      </w:hyperlink>
-      <w:r>
-        <w:rPr>
-          <w:b w:val="0"/>
-        </w:rPr>
-        <w:t>. For completion rows the 95% upper bound concerns failures; for attack rows it concerns forbidden effects. Bounds are descriptive for related cases. Replay is reproducibility evidence, not a second independent sample.</w:t>
+        <w:t>Proof-carrying wealth advice with inspectable decisions and controlled execution</w:t>
       </w:r>
     </w:p>
     <w:tbl>
       <w:tblPr>
-        <w:tblStyle w:val="TableGrid"/>
         <w:tblW w:type="auto" w:w="0"/>
         <w:jc w:val="center"/>
         <w:tblLayout w:type="fixed"/>
         <w:tblLook w:firstColumn="1" w:firstRow="1" w:lastColumn="0" w:lastRow="0" w:noHBand="0" w:noVBand="1" w:val="04A0"/>
       </w:tblPr>
       <w:tblGrid>
-        <w:gridCol w:w="2469"/>
-        <w:gridCol w:w="2469"/>
-        <w:gridCol w:w="2469"/>
-        <w:gridCol w:w="2469"/>
+        <w:gridCol w:w="2232"/>
+        <w:gridCol w:w="7646"/>
       </w:tblGrid>
       <w:tr>
         <w:trPr>
           <w:cantSplit/>
-          <w:tblHeader/>
         </w:trPr>
         <w:tc>
           <w:tcPr>
-            <w:tcW w:type="dxa" w:w="2469"/>
-            <w:shd w:fill="E8EFF6"/>
+            <w:tcW w:type="dxa" w:w="2232"/>
+            <w:shd w:fill="EEF3FF"/>
+            <w:tcMar>
+              <w:top w:w="100" w:type="dxa"/>
+              <w:left w:w="100" w:type="dxa"/>
+              <w:bottom w:w="100" w:type="dxa"/>
+              <w:right w:w="100" w:type="dxa"/>
+            </w:tcMar>
+            <w:tcBorders>
+              <w:top w:val="single" w:sz="4" w:color="D9D9D9"/>
+              <w:left w:val="single" w:sz="4" w:color="D9D9D9"/>
+              <w:bottom w:val="single" w:sz="4" w:color="D9D9D9"/>
+              <w:right w:val="single" w:sz="4" w:color="D9D9D9"/>
+            </w:tcBorders>
+            <w:shd w:fill="EEF2FF"/>
           </w:tcPr>
           <w:p>
             <w:pPr>
-              <w:spacing w:after="60" w:before="40"/>
+              <w:spacing w:after="40" w:before="40" w:line="252" w:lineRule="auto"/>
             </w:pPr>
             <w:r>
               <w:rPr>
+                <w:rFonts w:ascii="Arial" w:hAnsi="Arial"/>
                 <w:b/>
-                <w:sz w:val="16"/>
+                <w:color w:val="17213A"/>
+                <w:sz w:val="20"/>
               </w:rPr>
-              <w:t>Mode</w:t>
+              <w:t>Team name</w:t>
             </w:r>
           </w:p>
         </w:tc>
         <w:tc>
           <w:tcPr>
-            <w:tcW w:type="dxa" w:w="2469"/>
-            <w:shd w:fill="E8EFF6"/>
+            <w:tcW w:type="dxa" w:w="7646"/>
+            <w:tcMar>
+              <w:top w:w="100" w:type="dxa"/>
+              <w:left w:w="100" w:type="dxa"/>
+              <w:bottom w:w="100" w:type="dxa"/>
+              <w:right w:w="100" w:type="dxa"/>
+            </w:tcMar>
+            <w:tcBorders>
+              <w:top w:val="single" w:sz="4" w:color="D9D9D9"/>
+              <w:left w:val="single" w:sz="4" w:color="D9D9D9"/>
+              <w:bottom w:val="single" w:sz="4" w:color="D9D9D9"/>
+              <w:right w:val="single" w:sz="4" w:color="D9D9D9"/>
+            </w:tcBorders>
+            <w:shd w:fill="FFFFFF"/>
           </w:tcPr>
           <w:p>
             <w:pPr>
-              <w:spacing w:after="60" w:before="40"/>
+              <w:spacing w:after="40" w:before="40" w:line="252" w:lineRule="auto"/>
             </w:pPr>
             <w:r>
               <w:rPr>
-                <w:b/>
-                <w:sz w:val="16"/>
+                <w:rFonts w:ascii="Arial" w:hAnsi="Arial"/>
+                <w:b w:val="0"/>
+                <w:color w:val="17213A"/>
+                <w:sz w:val="20"/>
               </w:rPr>
-              <w:t>Observation</w:t>
-            </w:r>
-          </w:p>
-        </w:tc>
-        <w:tc>
-          <w:tcPr>
-            <w:tcW w:type="dxa" w:w="2469"/>
-            <w:shd w:fill="E8EFF6"/>
-          </w:tcPr>
-          <w:p>
-            <w:pPr>
-              <w:spacing w:after="60" w:before="40"/>
-            </w:pPr>
-            <w:r>
-              <w:rPr>
-                <w:b/>
-                <w:sz w:val="16"/>
-              </w:rPr>
-              <w:t>Adverse proportion upper 95%</w:t>
-            </w:r>
-          </w:p>
-        </w:tc>
-        <w:tc>
-          <w:tcPr>
-            <w:tcW w:type="dxa" w:w="2469"/>
-            <w:shd w:fill="E8EFF6"/>
-          </w:tcPr>
-          <w:p>
-            <w:pPr>
-              <w:spacing w:after="60" w:before="40"/>
-            </w:pPr>
-            <w:r>
-              <w:rPr>
-                <w:b/>
-                <w:sz w:val="16"/>
-              </w:rPr>
-              <w:t>Evidence</w:t>
+              <w:t>{{TEAM_NAME}}</w:t>
             </w:r>
           </w:p>
         </w:tc>
@@ -199,71 +131,67 @@
         </w:trPr>
         <w:tc>
           <w:tcPr>
-            <w:tcW w:type="dxa" w:w="2469"/>
+            <w:tcW w:type="dxa" w:w="2232"/>
+            <w:shd w:fill="EEF3FF"/>
+            <w:tcMar>
+              <w:top w:w="100" w:type="dxa"/>
+              <w:left w:w="100" w:type="dxa"/>
+              <w:bottom w:w="100" w:type="dxa"/>
+              <w:right w:w="100" w:type="dxa"/>
+            </w:tcMar>
+            <w:tcBorders>
+              <w:top w:val="single" w:sz="4" w:color="D9D9D9"/>
+              <w:left w:val="single" w:sz="4" w:color="D9D9D9"/>
+              <w:bottom w:val="single" w:sz="4" w:color="D9D9D9"/>
+              <w:right w:val="single" w:sz="4" w:color="D9D9D9"/>
+            </w:tcBorders>
+            <w:shd w:fill="EEF2FF"/>
           </w:tcPr>
           <w:p>
             <w:pPr>
-              <w:spacing w:after="60" w:before="40"/>
+              <w:spacing w:after="40" w:before="40" w:line="252" w:lineRule="auto"/>
             </w:pPr>
             <w:r>
               <w:rPr>
-                <w:b w:val="0"/>
-                <w:sz w:val="16"/>
+                <w:rFonts w:ascii="Arial" w:hAnsi="Arial"/>
+                <w:b/>
+                <w:color w:val="17213A"/>
+                <w:sz w:val="20"/>
               </w:rPr>
-              <w:t>scripted</w:t>
+              <w:t>Competition track</w:t>
             </w:r>
           </w:p>
         </w:tc>
         <w:tc>
           <w:tcPr>
-            <w:tcW w:type="dxa" w:w="2469"/>
+            <w:tcW w:type="dxa" w:w="7646"/>
+            <w:tcMar>
+              <w:top w:w="100" w:type="dxa"/>
+              <w:left w:w="100" w:type="dxa"/>
+              <w:bottom w:w="100" w:type="dxa"/>
+              <w:right w:w="100" w:type="dxa"/>
+            </w:tcMar>
+            <w:tcBorders>
+              <w:top w:val="single" w:sz="4" w:color="D9D9D9"/>
+              <w:left w:val="single" w:sz="4" w:color="D9D9D9"/>
+              <w:bottom w:val="single" w:sz="4" w:color="D9D9D9"/>
+              <w:right w:val="single" w:sz="4" w:color="D9D9D9"/>
+            </w:tcBorders>
+            <w:shd w:fill="FFFFFF"/>
           </w:tcPr>
           <w:p>
             <w:pPr>
-              <w:spacing w:after="60" w:before="40"/>
+              <w:spacing w:after="40" w:before="40" w:line="252" w:lineRule="auto"/>
             </w:pPr>
             <w:r>
               <w:rPr>
+                <w:rFonts w:ascii="Arial" w:hAnsi="Arial"/>
                 <w:b w:val="0"/>
-                <w:sz w:val="16"/>
+                <w:color w:val="17213A"/>
+                <w:sz w:val="20"/>
               </w:rPr>
-              <w:t>J bank tasks: 24/24</w:t>
+              <w:t>International AI Track — Topic B: Wealth Advisory Agent</w:t>
             </w:r>
-          </w:p>
-        </w:tc>
-        <w:tc>
-          <w:tcPr>
-            <w:tcW w:type="dxa" w:w="2469"/>
-          </w:tcPr>
-          <w:p>
-            <w:pPr>
-              <w:spacing w:after="60" w:before="40"/>
-            </w:pPr>
-            <w:r>
-              <w:rPr>
-                <w:b w:val="0"/>
-                <w:sz w:val="16"/>
-              </w:rPr>
-              <w:t>failure: approximately min(1, 3/24) = 12.5000%</w:t>
-            </w:r>
-          </w:p>
-        </w:tc>
-        <w:tc>
-          <w:tcPr>
-            <w:tcW w:type="dxa" w:w="2469"/>
-          </w:tcPr>
-          <w:p>
-            <w:pPr>
-              <w:spacing w:after="60" w:before="40"/>
-            </w:pPr>
-            <w:hyperlink r:id="rId12">
-              <w:r>
-                <w:rPr>
-                  <w:color w:val="163B65"/>
-                </w:rPr>
-                <w:t>source</w:t>
-              </w:r>
-            </w:hyperlink>
           </w:p>
         </w:tc>
       </w:tr>
@@ -273,71 +201,258 @@
         </w:trPr>
         <w:tc>
           <w:tcPr>
-            <w:tcW w:type="dxa" w:w="2469"/>
+            <w:tcW w:type="dxa" w:w="2232"/>
+            <w:shd w:fill="EEF3FF"/>
+            <w:tcMar>
+              <w:top w:w="100" w:type="dxa"/>
+              <w:left w:w="100" w:type="dxa"/>
+              <w:bottom w:w="100" w:type="dxa"/>
+              <w:right w:w="100" w:type="dxa"/>
+            </w:tcMar>
+            <w:tcBorders>
+              <w:top w:val="single" w:sz="4" w:color="D9D9D9"/>
+              <w:left w:val="single" w:sz="4" w:color="D9D9D9"/>
+              <w:bottom w:val="single" w:sz="4" w:color="D9D9D9"/>
+              <w:right w:val="single" w:sz="4" w:color="D9D9D9"/>
+            </w:tcBorders>
+            <w:shd w:fill="EEF2FF"/>
           </w:tcPr>
           <w:p>
             <w:pPr>
-              <w:spacing w:after="60" w:before="40"/>
+              <w:spacing w:after="40" w:before="40" w:line="252" w:lineRule="auto"/>
             </w:pPr>
             <w:r>
               <w:rPr>
-                <w:b w:val="0"/>
-                <w:sz w:val="16"/>
+                <w:rFonts w:ascii="Arial" w:hAnsi="Arial"/>
+                <w:b/>
+                <w:color w:val="17213A"/>
+                <w:sz w:val="20"/>
               </w:rPr>
-              <w:t>scripted</w:t>
+              <w:t>Submission date</w:t>
             </w:r>
           </w:p>
         </w:tc>
         <w:tc>
           <w:tcPr>
-            <w:tcW w:type="dxa" w:w="2469"/>
+            <w:tcW w:type="dxa" w:w="7646"/>
+            <w:tcMar>
+              <w:top w:w="100" w:type="dxa"/>
+              <w:left w:w="100" w:type="dxa"/>
+              <w:bottom w:w="100" w:type="dxa"/>
+              <w:right w:w="100" w:type="dxa"/>
+            </w:tcMar>
+            <w:tcBorders>
+              <w:top w:val="single" w:sz="4" w:color="D9D9D9"/>
+              <w:left w:val="single" w:sz="4" w:color="D9D9D9"/>
+              <w:bottom w:val="single" w:sz="4" w:color="D9D9D9"/>
+              <w:right w:val="single" w:sz="4" w:color="D9D9D9"/>
+            </w:tcBorders>
+            <w:shd w:fill="FFFFFF"/>
           </w:tcPr>
           <w:p>
             <w:pPr>
-              <w:spacing w:after="60" w:before="40"/>
+              <w:spacing w:after="40" w:before="40" w:line="252" w:lineRule="auto"/>
             </w:pPr>
             <w:r>
               <w:rPr>
+                <w:rFonts w:ascii="Arial" w:hAnsi="Arial"/>
                 <w:b w:val="0"/>
-                <w:sz w:val="16"/>
+                <w:color w:val="17213A"/>
+                <w:sz w:val="20"/>
               </w:rPr>
-              <w:t>W mechanism tasks: 12/12; 74/74 formal subcases</w:t>
+              <w:t>2026-10-20</w:t>
+            </w:r>
+          </w:p>
+        </w:tc>
+      </w:tr>
+    </w:tbl>
+    <w:p/>
+    <w:p>
+      <w:pPr>
+        <w:pStyle w:val="Heading1"/>
+        <w:keepNext/>
+        <w:pageBreakBefore w:val="0"/>
+      </w:pPr>
+      <w:r>
+        <w:t>01 Evidence Summary</w:t>
+      </w:r>
+    </w:p>
+    <w:p>
+      <w:pPr>
+        <w:pStyle w:val="Heading2"/>
+        <w:keepNext/>
+        <w:pageBreakBefore w:val="0"/>
+      </w:pPr>
+      <w:r>
+        <w:t>What this evidence demonstrates</w:t>
+      </w:r>
+    </w:p>
+    <w:p>
+      <w:r>
+        <w:t>This document connects the Topic B advisory workflow to recorded decisions, approvals, synthetic-bank effects and reproduction commands. The central claim is inspectability: a permitted purchase can be traced from signed client goals through the BIAC and current approval card to the bank receipt and audit chain.</w:t>
+      </w:r>
+    </w:p>
+    <w:p>
+      <w:r>
+        <w:t xml:space="preserve">The accompanying documents use </w:t>
+      </w:r>
+      <w:r>
+        <w:rPr>
+          <w:b/>
+        </w:rPr>
+        <w:t>synthetic data</w:t>
+      </w:r>
+      <w:r>
+        <w:t xml:space="preserve">, </w:t>
+      </w:r>
+      <w:r>
+        <w:rPr>
+          <w:b/>
+        </w:rPr>
+        <w:t>simulated MFA</w:t>
+      </w:r>
+      <w:r>
+        <w:t xml:space="preserve"> and a </w:t>
+      </w:r>
+      <w:r>
+        <w:rPr>
+          <w:b/>
+        </w:rPr>
+        <w:t>policy-checked heuristic</w:t>
+      </w:r>
+      <w:r>
+        <w:t xml:space="preserve">. All displayed return estimates are </w:t>
+      </w:r>
+      <w:r>
+        <w:rPr>
+          <w:b/>
+        </w:rPr>
+        <w:t>performance benchmark (not guaranteed)</w:t>
+      </w:r>
+      <w:r>
+        <w:t xml:space="preserve">. The prototype is </w:t>
+      </w:r>
+      <w:r>
+        <w:rPr>
+          <w:b/>
+        </w:rPr>
+        <w:t>not investment advice</w:t>
+      </w:r>
+      <w:r>
+        <w:t xml:space="preserve"> and does not connect a real financial account.</w:t>
+      </w:r>
+    </w:p>
+    <w:tbl>
+      <w:tblPr>
+        <w:tblW w:type="auto" w:w="0"/>
+        <w:jc w:val="center"/>
+        <w:tblLayout w:type="fixed"/>
+        <w:tblLook w:firstColumn="1" w:firstRow="1" w:lastColumn="0" w:lastRow="0" w:noHBand="0" w:noVBand="1" w:val="04A0"/>
+      </w:tblPr>
+      <w:tblGrid>
+        <w:gridCol w:w="2232"/>
+        <w:gridCol w:w="3960"/>
+        <w:gridCol w:w="3686"/>
+      </w:tblGrid>
+      <w:tr>
+        <w:trPr>
+          <w:cantSplit/>
+          <w:tblHeader/>
+        </w:trPr>
+        <w:tc>
+          <w:tcPr>
+            <w:tcW w:type="dxa" w:w="2232"/>
+            <w:tcMar>
+              <w:top w:w="100" w:type="dxa"/>
+              <w:left w:w="100" w:type="dxa"/>
+              <w:bottom w:w="100" w:type="dxa"/>
+              <w:right w:w="100" w:type="dxa"/>
+            </w:tcMar>
+            <w:tcBorders>
+              <w:top w:val="single" w:sz="4" w:color="D9D9D9"/>
+              <w:left w:val="single" w:sz="4" w:color="D9D9D9"/>
+              <w:bottom w:val="single" w:sz="4" w:color="D9D9D9"/>
+              <w:right w:val="single" w:sz="4" w:color="D9D9D9"/>
+            </w:tcBorders>
+            <w:shd w:fill="17213A"/>
+          </w:tcPr>
+          <w:p>
+            <w:pPr>
+              <w:spacing w:after="40" w:before="40" w:line="252" w:lineRule="auto"/>
+            </w:pPr>
+            <w:r>
+              <w:rPr>
+                <w:rFonts w:ascii="Arial" w:hAnsi="Arial"/>
+                <w:b/>
+                <w:color w:val="FFFFFF"/>
+                <w:sz w:val="18"/>
+              </w:rPr>
+              <w:t>Evidence mode</w:t>
             </w:r>
           </w:p>
         </w:tc>
         <w:tc>
           <w:tcPr>
-            <w:tcW w:type="dxa" w:w="2469"/>
+            <w:tcW w:type="dxa" w:w="3960"/>
+            <w:tcMar>
+              <w:top w:w="100" w:type="dxa"/>
+              <w:left w:w="100" w:type="dxa"/>
+              <w:bottom w:w="100" w:type="dxa"/>
+              <w:right w:w="100" w:type="dxa"/>
+            </w:tcMar>
+            <w:tcBorders>
+              <w:top w:val="single" w:sz="4" w:color="D9D9D9"/>
+              <w:left w:val="single" w:sz="4" w:color="D9D9D9"/>
+              <w:bottom w:val="single" w:sz="4" w:color="D9D9D9"/>
+              <w:right w:val="single" w:sz="4" w:color="D9D9D9"/>
+            </w:tcBorders>
+            <w:shd w:fill="17213A"/>
           </w:tcPr>
           <w:p>
             <w:pPr>
-              <w:spacing w:after="60" w:before="40"/>
+              <w:spacing w:after="40" w:before="40" w:line="252" w:lineRule="auto"/>
             </w:pPr>
             <w:r>
               <w:rPr>
-                <w:b w:val="0"/>
-                <w:sz w:val="16"/>
+                <w:rFonts w:ascii="Arial" w:hAnsi="Arial"/>
+                <w:b/>
+                <w:color w:val="FFFFFF"/>
+                <w:sz w:val="18"/>
               </w:rPr>
-              <w:t>failure: approximately min(1, 3/12) = 25.0000%</w:t>
+              <w:t>Meaning</w:t>
             </w:r>
           </w:p>
         </w:tc>
         <w:tc>
           <w:tcPr>
-            <w:tcW w:type="dxa" w:w="2469"/>
+            <w:tcW w:type="dxa" w:w="3686"/>
+            <w:tcMar>
+              <w:top w:w="100" w:type="dxa"/>
+              <w:left w:w="100" w:type="dxa"/>
+              <w:bottom w:w="100" w:type="dxa"/>
+              <w:right w:w="100" w:type="dxa"/>
+            </w:tcMar>
+            <w:tcBorders>
+              <w:top w:val="single" w:sz="4" w:color="D9D9D9"/>
+              <w:left w:val="single" w:sz="4" w:color="D9D9D9"/>
+              <w:bottom w:val="single" w:sz="4" w:color="D9D9D9"/>
+              <w:right w:val="single" w:sz="4" w:color="D9D9D9"/>
+            </w:tcBorders>
+            <w:shd w:fill="17213A"/>
           </w:tcPr>
           <w:p>
             <w:pPr>
-              <w:spacing w:after="60" w:before="40"/>
+              <w:spacing w:after="40" w:before="40" w:line="252" w:lineRule="auto"/>
             </w:pPr>
-            <w:hyperlink r:id="rId13">
-              <w:r>
-                <w:rPr>
-                  <w:color w:val="163B65"/>
-                </w:rPr>
-                <w:t>source</w:t>
-              </w:r>
-            </w:hyperlink>
+            <w:r>
+              <w:rPr>
+                <w:rFonts w:ascii="Arial" w:hAnsi="Arial"/>
+                <w:b/>
+                <w:color w:val="FFFFFF"/>
+                <w:sz w:val="18"/>
+              </w:rPr>
+              <w:t>What it cannot establish</w:t>
+            </w:r>
           </w:p>
         </w:tc>
       </w:tr>
@@ -347,71 +462,98 @@
         </w:trPr>
         <w:tc>
           <w:tcPr>
-            <w:tcW w:type="dxa" w:w="2469"/>
+            <w:tcW w:type="dxa" w:w="2232"/>
+            <w:tcMar>
+              <w:top w:w="100" w:type="dxa"/>
+              <w:left w:w="100" w:type="dxa"/>
+              <w:bottom w:w="100" w:type="dxa"/>
+              <w:right w:w="100" w:type="dxa"/>
+            </w:tcMar>
+            <w:tcBorders>
+              <w:top w:val="single" w:sz="4" w:color="D9D9D9"/>
+              <w:left w:val="single" w:sz="4" w:color="D9D9D9"/>
+              <w:bottom w:val="single" w:sz="4" w:color="D9D9D9"/>
+              <w:right w:val="single" w:sz="4" w:color="D9D9D9"/>
+            </w:tcBorders>
+            <w:shd w:fill="FFFFFF"/>
           </w:tcPr>
           <w:p>
             <w:pPr>
-              <w:spacing w:after="60" w:before="40"/>
+              <w:spacing w:after="40" w:before="40" w:line="252" w:lineRule="auto"/>
             </w:pPr>
             <w:r>
               <w:rPr>
+                <w:rFonts w:ascii="Arial" w:hAnsi="Arial"/>
                 <w:b w:val="0"/>
-                <w:sz w:val="16"/>
+                <w:color w:val="17213A"/>
+                <w:sz w:val="18"/>
               </w:rPr>
-              <w:t>scripted</w:t>
+              <w:t>Scripted</w:t>
             </w:r>
           </w:p>
         </w:tc>
         <w:tc>
           <w:tcPr>
-            <w:tcW w:type="dxa" w:w="2469"/>
+            <w:tcW w:type="dxa" w:w="3960"/>
+            <w:tcMar>
+              <w:top w:w="100" w:type="dxa"/>
+              <w:left w:w="100" w:type="dxa"/>
+              <w:bottom w:w="100" w:type="dxa"/>
+              <w:right w:w="100" w:type="dxa"/>
+            </w:tcMar>
+            <w:tcBorders>
+              <w:top w:val="single" w:sz="4" w:color="D9D9D9"/>
+              <w:left w:val="single" w:sz="4" w:color="D9D9D9"/>
+              <w:bottom w:val="single" w:sz="4" w:color="D9D9D9"/>
+              <w:right w:val="single" w:sz="4" w:color="D9D9D9"/>
+            </w:tcBorders>
+            <w:shd w:fill="FFFFFF"/>
           </w:tcPr>
           <w:p>
             <w:pPr>
-              <w:spacing w:after="60" w:before="40"/>
+              <w:spacing w:after="40" w:before="40" w:line="252" w:lineRule="auto"/>
             </w:pPr>
             <w:r>
               <w:rPr>
+                <w:rFonts w:ascii="Arial" w:hAnsi="Arial"/>
                 <w:b w:val="0"/>
-                <w:sz w:val="16"/>
+                <w:color w:val="17213A"/>
+                <w:sz w:val="18"/>
               </w:rPr>
-              <w:t>Byzantine forbidden effects: 0/40</w:t>
+              <w:t>Deterministic mechanism or UI execution with synthetic input</w:t>
             </w:r>
           </w:p>
         </w:tc>
         <w:tc>
           <w:tcPr>
-            <w:tcW w:type="dxa" w:w="2469"/>
+            <w:tcW w:type="dxa" w:w="3686"/>
+            <w:tcMar>
+              <w:top w:w="100" w:type="dxa"/>
+              <w:left w:w="100" w:type="dxa"/>
+              <w:bottom w:w="100" w:type="dxa"/>
+              <w:right w:w="100" w:type="dxa"/>
+            </w:tcMar>
+            <w:tcBorders>
+              <w:top w:val="single" w:sz="4" w:color="D9D9D9"/>
+              <w:left w:val="single" w:sz="4" w:color="D9D9D9"/>
+              <w:bottom w:val="single" w:sz="4" w:color="D9D9D9"/>
+              <w:right w:val="single" w:sz="4" w:color="D9D9D9"/>
+            </w:tcBorders>
+            <w:shd w:fill="FFFFFF"/>
           </w:tcPr>
           <w:p>
             <w:pPr>
-              <w:spacing w:after="60" w:before="40"/>
+              <w:spacing w:after="40" w:before="40" w:line="252" w:lineRule="auto"/>
             </w:pPr>
             <w:r>
               <w:rPr>
+                <w:rFonts w:ascii="Arial" w:hAnsi="Arial"/>
                 <w:b w:val="0"/>
-                <w:sz w:val="16"/>
+                <w:color w:val="17213A"/>
+                <w:sz w:val="18"/>
               </w:rPr>
-              <w:t>effect: approximately min(1, 3/40) = 7.5000%</w:t>
+              <w:t>Live-model competence</w:t>
             </w:r>
-          </w:p>
-        </w:tc>
-        <w:tc>
-          <w:tcPr>
-            <w:tcW w:type="dxa" w:w="2469"/>
-          </w:tcPr>
-          <w:p>
-            <w:pPr>
-              <w:spacing w:after="60" w:before="40"/>
-            </w:pPr>
-            <w:hyperlink r:id="rId14">
-              <w:r>
-                <w:rPr>
-                  <w:color w:val="163B65"/>
-                </w:rPr>
-                <w:t>source</w:t>
-              </w:r>
-            </w:hyperlink>
           </w:p>
         </w:tc>
       </w:tr>
@@ -421,71 +563,98 @@
         </w:trPr>
         <w:tc>
           <w:tcPr>
-            <w:tcW w:type="dxa" w:w="2469"/>
+            <w:tcW w:type="dxa" w:w="2232"/>
+            <w:tcMar>
+              <w:top w:w="100" w:type="dxa"/>
+              <w:left w:w="100" w:type="dxa"/>
+              <w:bottom w:w="100" w:type="dxa"/>
+              <w:right w:w="100" w:type="dxa"/>
+            </w:tcMar>
+            <w:tcBorders>
+              <w:top w:val="single" w:sz="4" w:color="D9D9D9"/>
+              <w:left w:val="single" w:sz="4" w:color="D9D9D9"/>
+              <w:bottom w:val="single" w:sz="4" w:color="D9D9D9"/>
+              <w:right w:val="single" w:sz="4" w:color="D9D9D9"/>
+            </w:tcBorders>
+            <w:shd w:fill="F3F6FA"/>
           </w:tcPr>
           <w:p>
             <w:pPr>
-              <w:spacing w:after="60" w:before="40"/>
+              <w:spacing w:after="40" w:before="40" w:line="252" w:lineRule="auto"/>
             </w:pPr>
             <w:r>
               <w:rPr>
+                <w:rFonts w:ascii="Arial" w:hAnsi="Arial"/>
                 <w:b w:val="0"/>
-                <w:sz w:val="16"/>
+                <w:color w:val="17213A"/>
+                <w:sz w:val="18"/>
               </w:rPr>
-              <w:t>live-recorded</w:t>
+              <w:t>Live-recorded</w:t>
             </w:r>
           </w:p>
         </w:tc>
         <w:tc>
           <w:tcPr>
-            <w:tcW w:type="dxa" w:w="2469"/>
+            <w:tcW w:type="dxa" w:w="3960"/>
+            <w:tcMar>
+              <w:top w:w="100" w:type="dxa"/>
+              <w:left w:w="100" w:type="dxa"/>
+              <w:bottom w:w="100" w:type="dxa"/>
+              <w:right w:w="100" w:type="dxa"/>
+            </w:tcMar>
+            <w:tcBorders>
+              <w:top w:val="single" w:sz="4" w:color="D9D9D9"/>
+              <w:left w:val="single" w:sz="4" w:color="D9D9D9"/>
+              <w:bottom w:val="single" w:sz="4" w:color="D9D9D9"/>
+              <w:right w:val="single" w:sz="4" w:color="D9D9D9"/>
+            </w:tcBorders>
+            <w:shd w:fill="F3F6FA"/>
           </w:tcPr>
           <w:p>
             <w:pPr>
-              <w:spacing w:after="60" w:before="40"/>
+              <w:spacing w:after="40" w:before="40" w:line="252" w:lineRule="auto"/>
             </w:pPr>
             <w:r>
               <w:rPr>
+                <w:rFonts w:ascii="Arial" w:hAnsi="Arial"/>
                 <w:b w:val="0"/>
-                <w:sz w:val="16"/>
+                <w:color w:val="17213A"/>
+                <w:sz w:val="18"/>
               </w:rPr>
-              <w:t>J bank tasks: 24/24; Recorded tasks 24/24; strict replay identical 24/24</w:t>
+              <w:t>A model response passed through the guarded entry point and was saved</w:t>
             </w:r>
           </w:p>
         </w:tc>
         <w:tc>
           <w:tcPr>
-            <w:tcW w:type="dxa" w:w="2469"/>
+            <w:tcW w:type="dxa" w:w="3686"/>
+            <w:tcMar>
+              <w:top w:w="100" w:type="dxa"/>
+              <w:left w:w="100" w:type="dxa"/>
+              <w:bottom w:w="100" w:type="dxa"/>
+              <w:right w:w="100" w:type="dxa"/>
+            </w:tcMar>
+            <w:tcBorders>
+              <w:top w:val="single" w:sz="4" w:color="D9D9D9"/>
+              <w:left w:val="single" w:sz="4" w:color="D9D9D9"/>
+              <w:bottom w:val="single" w:sz="4" w:color="D9D9D9"/>
+              <w:right w:val="single" w:sz="4" w:color="D9D9D9"/>
+            </w:tcBorders>
+            <w:shd w:fill="F3F6FA"/>
           </w:tcPr>
           <w:p>
             <w:pPr>
-              <w:spacing w:after="60" w:before="40"/>
+              <w:spacing w:after="40" w:before="40" w:line="252" w:lineRule="auto"/>
             </w:pPr>
             <w:r>
               <w:rPr>
+                <w:rFonts w:ascii="Arial" w:hAnsi="Arial"/>
                 <w:b w:val="0"/>
-                <w:sz w:val="16"/>
+                <w:color w:val="17213A"/>
+                <w:sz w:val="18"/>
               </w:rPr>
-              <w:t>failure: approximately min(1, 3/24) = 12.5000%</w:t>
+              <w:t>Generalization beyond the disclosed tasks</w:t>
             </w:r>
-          </w:p>
-        </w:tc>
-        <w:tc>
-          <w:tcPr>
-            <w:tcW w:type="dxa" w:w="2469"/>
-          </w:tcPr>
-          <w:p>
-            <w:pPr>
-              <w:spacing w:after="60" w:before="40"/>
-            </w:pPr>
-            <w:hyperlink r:id="rId15">
-              <w:r>
-                <w:rPr>
-                  <w:color w:val="163B65"/>
-                </w:rPr>
-                <w:t>source</w:t>
-              </w:r>
-            </w:hyperlink>
           </w:p>
         </w:tc>
       </w:tr>
@@ -495,71 +664,98 @@
         </w:trPr>
         <w:tc>
           <w:tcPr>
-            <w:tcW w:type="dxa" w:w="2469"/>
+            <w:tcW w:type="dxa" w:w="2232"/>
+            <w:tcMar>
+              <w:top w:w="100" w:type="dxa"/>
+              <w:left w:w="100" w:type="dxa"/>
+              <w:bottom w:w="100" w:type="dxa"/>
+              <w:right w:w="100" w:type="dxa"/>
+            </w:tcMar>
+            <w:tcBorders>
+              <w:top w:val="single" w:sz="4" w:color="D9D9D9"/>
+              <w:left w:val="single" w:sz="4" w:color="D9D9D9"/>
+              <w:bottom w:val="single" w:sz="4" w:color="D9D9D9"/>
+              <w:right w:val="single" w:sz="4" w:color="D9D9D9"/>
+            </w:tcBorders>
+            <w:shd w:fill="FFFFFF"/>
           </w:tcPr>
           <w:p>
             <w:pPr>
-              <w:spacing w:after="60" w:before="40"/>
+              <w:spacing w:after="40" w:before="40" w:line="252" w:lineRule="auto"/>
             </w:pPr>
             <w:r>
               <w:rPr>
+                <w:rFonts w:ascii="Arial" w:hAnsi="Arial"/>
                 <w:b w:val="0"/>
-                <w:sz w:val="16"/>
+                <w:color w:val="17213A"/>
+                <w:sz w:val="18"/>
               </w:rPr>
-              <w:t>live-recorded</w:t>
+              <w:t>Strict-replay</w:t>
             </w:r>
           </w:p>
         </w:tc>
         <w:tc>
           <w:tcPr>
-            <w:tcW w:type="dxa" w:w="2469"/>
+            <w:tcW w:type="dxa" w:w="3960"/>
+            <w:tcMar>
+              <w:top w:w="100" w:type="dxa"/>
+              <w:left w:w="100" w:type="dxa"/>
+              <w:bottom w:w="100" w:type="dxa"/>
+              <w:right w:w="100" w:type="dxa"/>
+            </w:tcMar>
+            <w:tcBorders>
+              <w:top w:val="single" w:sz="4" w:color="D9D9D9"/>
+              <w:left w:val="single" w:sz="4" w:color="D9D9D9"/>
+              <w:bottom w:val="single" w:sz="4" w:color="D9D9D9"/>
+              <w:right w:val="single" w:sz="4" w:color="D9D9D9"/>
+            </w:tcBorders>
+            <w:shd w:fill="FFFFFF"/>
           </w:tcPr>
           <w:p>
             <w:pPr>
-              <w:spacing w:after="60" w:before="40"/>
+              <w:spacing w:after="40" w:before="40" w:line="252" w:lineRule="auto"/>
             </w:pPr>
             <w:r>
               <w:rPr>
+                <w:rFonts w:ascii="Arial" w:hAnsi="Arial"/>
                 <w:b w:val="0"/>
-                <w:sz w:val="16"/>
+                <w:color w:val="17213A"/>
+                <w:sz w:val="18"/>
               </w:rPr>
-              <w:t>W advisory tasks: 12/12; 30/30 workflows; Recorded tasks 12/12; strict replay identical 12/12</w:t>
+              <w:t>Matching saved response used with provider transport disabled</w:t>
             </w:r>
           </w:p>
         </w:tc>
         <w:tc>
           <w:tcPr>
-            <w:tcW w:type="dxa" w:w="2469"/>
+            <w:tcW w:type="dxa" w:w="3686"/>
+            <w:tcMar>
+              <w:top w:w="100" w:type="dxa"/>
+              <w:left w:w="100" w:type="dxa"/>
+              <w:bottom w:w="100" w:type="dxa"/>
+              <w:right w:w="100" w:type="dxa"/>
+            </w:tcMar>
+            <w:tcBorders>
+              <w:top w:val="single" w:sz="4" w:color="D9D9D9"/>
+              <w:left w:val="single" w:sz="4" w:color="D9D9D9"/>
+              <w:bottom w:val="single" w:sz="4" w:color="D9D9D9"/>
+              <w:right w:val="single" w:sz="4" w:color="D9D9D9"/>
+            </w:tcBorders>
+            <w:shd w:fill="FFFFFF"/>
           </w:tcPr>
           <w:p>
             <w:pPr>
-              <w:spacing w:after="60" w:before="40"/>
+              <w:spacing w:after="40" w:before="40" w:line="252" w:lineRule="auto"/>
             </w:pPr>
             <w:r>
               <w:rPr>
+                <w:rFonts w:ascii="Arial" w:hAnsi="Arial"/>
                 <w:b w:val="0"/>
-                <w:sz w:val="16"/>
+                <w:color w:val="17213A"/>
+                <w:sz w:val="18"/>
               </w:rPr>
-              <w:t>failure: approximately min(1, 3/12) = 25.0000%</w:t>
+              <w:t>A second independent model sample</w:t>
             </w:r>
-          </w:p>
-        </w:tc>
-        <w:tc>
-          <w:tcPr>
-            <w:tcW w:type="dxa" w:w="2469"/>
-          </w:tcPr>
-          <w:p>
-            <w:pPr>
-              <w:spacing w:after="60" w:before="40"/>
-            </w:pPr>
-            <w:hyperlink r:id="rId15">
-              <w:r>
-                <w:rPr>
-                  <w:color w:val="163B65"/>
-                </w:rPr>
-                <w:t>source</w:t>
-              </w:r>
-            </w:hyperlink>
           </w:p>
         </w:tc>
       </w:tr>
@@ -569,71 +765,350 @@
         </w:trPr>
         <w:tc>
           <w:tcPr>
-            <w:tcW w:type="dxa" w:w="2469"/>
+            <w:tcW w:type="dxa" w:w="2232"/>
+            <w:tcMar>
+              <w:top w:w="100" w:type="dxa"/>
+              <w:left w:w="100" w:type="dxa"/>
+              <w:bottom w:w="100" w:type="dxa"/>
+              <w:right w:w="100" w:type="dxa"/>
+            </w:tcMar>
+            <w:tcBorders>
+              <w:top w:val="single" w:sz="4" w:color="D9D9D9"/>
+              <w:left w:val="single" w:sz="4" w:color="D9D9D9"/>
+              <w:bottom w:val="single" w:sz="4" w:color="D9D9D9"/>
+              <w:right w:val="single" w:sz="4" w:color="D9D9D9"/>
+            </w:tcBorders>
+            <w:shd w:fill="F3F6FA"/>
           </w:tcPr>
           <w:p>
             <w:pPr>
-              <w:spacing w:after="60" w:before="40"/>
+              <w:spacing w:after="40" w:before="40" w:line="252" w:lineRule="auto"/>
             </w:pPr>
             <w:r>
               <w:rPr>
+                <w:rFonts w:ascii="Arial" w:hAnsi="Arial"/>
                 <w:b w:val="0"/>
-                <w:sz w:val="16"/>
+                <w:color w:val="17213A"/>
+                <w:sz w:val="18"/>
               </w:rPr>
-              <w:t>live-recorded</w:t>
+              <w:t>Not run or unavailable</w:t>
             </w:r>
           </w:p>
         </w:tc>
         <w:tc>
           <w:tcPr>
-            <w:tcW w:type="dxa" w:w="2469"/>
+            <w:tcW w:type="dxa" w:w="3960"/>
+            <w:tcMar>
+              <w:top w:w="100" w:type="dxa"/>
+              <w:left w:w="100" w:type="dxa"/>
+              <w:bottom w:w="100" w:type="dxa"/>
+              <w:right w:w="100" w:type="dxa"/>
+            </w:tcMar>
+            <w:tcBorders>
+              <w:top w:val="single" w:sz="4" w:color="D9D9D9"/>
+              <w:left w:val="single" w:sz="4" w:color="D9D9D9"/>
+              <w:bottom w:val="single" w:sz="4" w:color="D9D9D9"/>
+              <w:right w:val="single" w:sz="4" w:color="D9D9D9"/>
+            </w:tcBorders>
+            <w:shd w:fill="F3F6FA"/>
           </w:tcPr>
           <w:p>
             <w:pPr>
-              <w:spacing w:after="60" w:before="40"/>
+              <w:spacing w:after="40" w:before="40" w:line="252" w:lineRule="auto"/>
             </w:pPr>
             <w:r>
               <w:rPr>
+                <w:rFonts w:ascii="Arial" w:hAnsi="Arial"/>
                 <w:b w:val="0"/>
-                <w:sz w:val="16"/>
+                <w:color w:val="17213A"/>
+                <w:sz w:val="18"/>
               </w:rPr>
-              <w:t>M2 fixed dialogue cases and smokes: 26/26; Recorded cases 26/26; strict replay PASS</w:t>
+              <w:t>No applicable measurement or required artifact in the package</w:t>
             </w:r>
           </w:p>
         </w:tc>
         <w:tc>
           <w:tcPr>
-            <w:tcW w:type="dxa" w:w="2469"/>
+            <w:tcW w:type="dxa" w:w="3686"/>
+            <w:tcMar>
+              <w:top w:w="100" w:type="dxa"/>
+              <w:left w:w="100" w:type="dxa"/>
+              <w:bottom w:w="100" w:type="dxa"/>
+              <w:right w:w="100" w:type="dxa"/>
+            </w:tcMar>
+            <w:tcBorders>
+              <w:top w:val="single" w:sz="4" w:color="D9D9D9"/>
+              <w:left w:val="single" w:sz="4" w:color="D9D9D9"/>
+              <w:bottom w:val="single" w:sz="4" w:color="D9D9D9"/>
+              <w:right w:val="single" w:sz="4" w:color="D9D9D9"/>
+            </w:tcBorders>
+            <w:shd w:fill="F3F6FA"/>
           </w:tcPr>
           <w:p>
             <w:pPr>
-              <w:spacing w:after="60" w:before="40"/>
+              <w:spacing w:after="40" w:before="40" w:line="252" w:lineRule="auto"/>
             </w:pPr>
             <w:r>
               <w:rPr>
+                <w:rFonts w:ascii="Arial" w:hAnsi="Arial"/>
                 <w:b w:val="0"/>
-                <w:sz w:val="16"/>
+                <w:color w:val="17213A"/>
+                <w:sz w:val="18"/>
               </w:rPr>
-              <w:t>failure: approximately min(1, 3/26) = 11.5385%</w:t>
+              <w:t>Success, zero risk or a completed demonstration</w:t>
+            </w:r>
+          </w:p>
+        </w:tc>
+      </w:tr>
+    </w:tbl>
+    <w:p>
+      <w:pPr>
+        <w:spacing w:after="40"/>
+      </w:pPr>
+    </w:p>
+    <w:p>
+      <w:r/>
+      <w:hyperlink r:id="rId10">
+        <w:r>
+          <w:rPr>
+            <w:color w:val="315FD8"/>
+          </w:rPr>
+          <w:t>FINAL-RESULTS</w:t>
+        </w:r>
+      </w:hyperlink>
+      <w:r>
+        <w:t xml:space="preserve"> records the original F5 measurements, backed by the complete </w:t>
+      </w:r>
+      <w:hyperlink r:id="rId11">
+        <w:r>
+          <w:rPr>
+            <w:color w:val="315FD8"/>
+          </w:rPr>
+          <w:t>recorded evidence bundle</w:t>
+        </w:r>
+      </w:hyperlink>
+      <w:r>
+        <w:t xml:space="preserve">. Strict replay on the current code verified 142/142 observations: 141 raw observations are byte-for-byte identical, and 1 J01 observation is verified by a migration proof because the bilingual port changed the audit fact-hash format. Network transport was disabled and no API calls occurred. P2's historical </w:t>
+      </w:r>
+      <w:r>
+        <w:rPr>
+          <w:b/>
+        </w:rPr>
+        <w:t>142/142</w:t>
+      </w:r>
+      <w:r>
+        <w:t xml:space="preserve"> byte-for-byte equality used code before I1. Replay equality preserves recorded failures and is not a new independent model sample. The reproduction section links the measured result.</w:t>
+      </w:r>
+    </w:p>
+    <w:p>
+      <w:r>
+        <w:t>The retained I1 screenshots were captured in scripted mode before W1 and retain synthetic/simulated labels. They are separate from historical F3 screenshots and from the retained live-recorded results. A screenshot or command is not proof that a filmed demonstration or external competition submission occurred.</w:t>
+      </w:r>
+    </w:p>
+    <w:p>
+      <w:pPr>
+        <w:pStyle w:val="Heading2"/>
+        <w:keepNext/>
+        <w:pageBreakBefore/>
+      </w:pPr>
+      <w:r>
+        <w:t>Reported completion with explicit denominators</w:t>
+      </w:r>
+    </w:p>
+    <w:p>
+      <w:pPr>
+        <w:keepNext/>
+        <w:spacing w:before="80" w:after="80"/>
+        <w:jc w:val="center"/>
+      </w:pPr>
+      <w:r>
+        <w:drawing>
+          <wp:inline xmlns:a="http://schemas.openxmlformats.org/drawingml/2006/main" xmlns:pic="http://schemas.openxmlformats.org/drawingml/2006/picture">
+            <wp:extent cx="6236208" cy="3507867"/>
+            <wp:docPr id="1" name="Picture 1" descr="F5 reported live-recorded completion and strict-replay agreement. The chart cites the original results report and retained recording bundle."/>
+            <wp:cNvGraphicFramePr>
+              <a:graphicFrameLocks noChangeAspect="1"/>
+            </wp:cNvGraphicFramePr>
+            <a:graphic>
+              <a:graphicData uri="http://schemas.openxmlformats.org/drawingml/2006/picture">
+                <pic:pic>
+                  <pic:nvPicPr>
+                    <pic:cNvPr id="0" name="completion.png"/>
+                    <pic:cNvPicPr/>
+                  </pic:nvPicPr>
+                  <pic:blipFill>
+                    <a:blip r:embed="rId12"/>
+                    <a:stretch>
+                      <a:fillRect/>
+                    </a:stretch>
+                  </pic:blipFill>
+                  <pic:spPr>
+                    <a:xfrm>
+                      <a:off x="0" y="0"/>
+                      <a:ext cx="6236208" cy="3507867"/>
+                    </a:xfrm>
+                    <a:prstGeom prst="rect"/>
+                  </pic:spPr>
+                </pic:pic>
+              </a:graphicData>
+            </a:graphic>
+          </wp:inline>
+        </w:drawing>
+      </w:r>
+    </w:p>
+    <w:p>
+      <w:pPr>
+        <w:pStyle w:val="Caption"/>
+        <w:spacing w:after="200"/>
+      </w:pPr>
+      <w:r>
+        <w:t>F5 reported live-recorded completion and strict-replay agreement. The chart cites the original results report and retained recording bundle.</w:t>
+      </w:r>
+    </w:p>
+    <w:tbl>
+      <w:tblPr>
+        <w:tblW w:type="auto" w:w="0"/>
+        <w:jc w:val="center"/>
+        <w:tblLayout w:type="fixed"/>
+        <w:tblLook w:firstColumn="1" w:firstRow="1" w:lastColumn="0" w:lastRow="0" w:noHBand="0" w:noVBand="1" w:val="04A0"/>
+      </w:tblPr>
+      <w:tblGrid>
+        <w:gridCol w:w="2016"/>
+        <w:gridCol w:w="1800"/>
+        <w:gridCol w:w="1800"/>
+        <w:gridCol w:w="4262"/>
+      </w:tblGrid>
+      <w:tr>
+        <w:trPr>
+          <w:cantSplit/>
+          <w:tblHeader/>
+        </w:trPr>
+        <w:tc>
+          <w:tcPr>
+            <w:tcW w:type="dxa" w:w="2016"/>
+            <w:tcMar>
+              <w:top w:w="100" w:type="dxa"/>
+              <w:left w:w="100" w:type="dxa"/>
+              <w:bottom w:w="100" w:type="dxa"/>
+              <w:right w:w="100" w:type="dxa"/>
+            </w:tcMar>
+            <w:tcBorders>
+              <w:top w:val="single" w:sz="4" w:color="D9D9D9"/>
+              <w:left w:val="single" w:sz="4" w:color="D9D9D9"/>
+              <w:bottom w:val="single" w:sz="4" w:color="D9D9D9"/>
+              <w:right w:val="single" w:sz="4" w:color="D9D9D9"/>
+            </w:tcBorders>
+            <w:shd w:fill="17213A"/>
+          </w:tcPr>
+          <w:p>
+            <w:pPr>
+              <w:spacing w:after="40" w:before="40" w:line="252" w:lineRule="auto"/>
+            </w:pPr>
+            <w:r>
+              <w:rPr>
+                <w:rFonts w:ascii="Arial" w:hAnsi="Arial"/>
+                <w:b/>
+                <w:color w:val="FFFFFF"/>
+                <w:sz w:val="18"/>
+              </w:rPr>
+              <w:t>Suite</w:t>
             </w:r>
           </w:p>
         </w:tc>
         <w:tc>
           <w:tcPr>
-            <w:tcW w:type="dxa" w:w="2469"/>
+            <w:tcW w:type="dxa" w:w="1800"/>
+            <w:tcMar>
+              <w:top w:w="100" w:type="dxa"/>
+              <w:left w:w="100" w:type="dxa"/>
+              <w:bottom w:w="100" w:type="dxa"/>
+              <w:right w:w="100" w:type="dxa"/>
+            </w:tcMar>
+            <w:tcBorders>
+              <w:top w:val="single" w:sz="4" w:color="D9D9D9"/>
+              <w:left w:val="single" w:sz="4" w:color="D9D9D9"/>
+              <w:bottom w:val="single" w:sz="4" w:color="D9D9D9"/>
+              <w:right w:val="single" w:sz="4" w:color="D9D9D9"/>
+            </w:tcBorders>
+            <w:shd w:fill="17213A"/>
           </w:tcPr>
           <w:p>
             <w:pPr>
-              <w:spacing w:after="60" w:before="40"/>
+              <w:spacing w:after="40" w:before="40" w:line="252" w:lineRule="auto"/>
             </w:pPr>
-            <w:hyperlink r:id="rId16">
-              <w:r>
-                <w:rPr>
-                  <w:color w:val="163B65"/>
-                </w:rPr>
-                <w:t>source</w:t>
-              </w:r>
-            </w:hyperlink>
+            <w:r>
+              <w:rPr>
+                <w:rFonts w:ascii="Arial" w:hAnsi="Arial"/>
+                <w:b/>
+                <w:color w:val="FFFFFF"/>
+                <w:sz w:val="18"/>
+              </w:rPr>
+              <w:t>Live-recorded completion</w:t>
+            </w:r>
+          </w:p>
+        </w:tc>
+        <w:tc>
+          <w:tcPr>
+            <w:tcW w:type="dxa" w:w="1800"/>
+            <w:tcMar>
+              <w:top w:w="100" w:type="dxa"/>
+              <w:left w:w="100" w:type="dxa"/>
+              <w:bottom w:w="100" w:type="dxa"/>
+              <w:right w:w="100" w:type="dxa"/>
+            </w:tcMar>
+            <w:tcBorders>
+              <w:top w:val="single" w:sz="4" w:color="D9D9D9"/>
+              <w:left w:val="single" w:sz="4" w:color="D9D9D9"/>
+              <w:bottom w:val="single" w:sz="4" w:color="D9D9D9"/>
+              <w:right w:val="single" w:sz="4" w:color="D9D9D9"/>
+            </w:tcBorders>
+            <w:shd w:fill="17213A"/>
+          </w:tcPr>
+          <w:p>
+            <w:pPr>
+              <w:spacing w:after="40" w:before="40" w:line="252" w:lineRule="auto"/>
+            </w:pPr>
+            <w:r>
+              <w:rPr>
+                <w:rFonts w:ascii="Arial" w:hAnsi="Arial"/>
+                <w:b/>
+                <w:color w:val="FFFFFF"/>
+                <w:sz w:val="18"/>
+              </w:rPr>
+              <w:t>Failure upper 95%</w:t>
+            </w:r>
+          </w:p>
+        </w:tc>
+        <w:tc>
+          <w:tcPr>
+            <w:tcW w:type="dxa" w:w="4262"/>
+            <w:tcMar>
+              <w:top w:w="100" w:type="dxa"/>
+              <w:left w:w="100" w:type="dxa"/>
+              <w:bottom w:w="100" w:type="dxa"/>
+              <w:right w:w="100" w:type="dxa"/>
+            </w:tcMar>
+            <w:tcBorders>
+              <w:top w:val="single" w:sz="4" w:color="D9D9D9"/>
+              <w:left w:val="single" w:sz="4" w:color="D9D9D9"/>
+              <w:bottom w:val="single" w:sz="4" w:color="D9D9D9"/>
+              <w:right w:val="single" w:sz="4" w:color="D9D9D9"/>
+            </w:tcBorders>
+            <w:shd w:fill="17213A"/>
+          </w:tcPr>
+          <w:p>
+            <w:pPr>
+              <w:spacing w:after="40" w:before="40" w:line="252" w:lineRule="auto"/>
+            </w:pPr>
+            <w:r>
+              <w:rPr>
+                <w:rFonts w:ascii="Arial" w:hAnsi="Arial"/>
+                <w:b/>
+                <w:color w:val="FFFFFF"/>
+                <w:sz w:val="18"/>
+              </w:rPr>
+              <w:t>Strict-replay status in F5 report</w:t>
+            </w:r>
           </w:p>
         </w:tc>
       </w:tr>
@@ -643,71 +1118,130 @@
         </w:trPr>
         <w:tc>
           <w:tcPr>
-            <w:tcW w:type="dxa" w:w="2469"/>
+            <w:tcW w:type="dxa" w:w="2016"/>
+            <w:tcMar>
+              <w:top w:w="100" w:type="dxa"/>
+              <w:left w:w="100" w:type="dxa"/>
+              <w:bottom w:w="100" w:type="dxa"/>
+              <w:right w:w="100" w:type="dxa"/>
+            </w:tcMar>
+            <w:tcBorders>
+              <w:top w:val="single" w:sz="4" w:color="D9D9D9"/>
+              <w:left w:val="single" w:sz="4" w:color="D9D9D9"/>
+              <w:bottom w:val="single" w:sz="4" w:color="D9D9D9"/>
+              <w:right w:val="single" w:sz="4" w:color="D9D9D9"/>
+            </w:tcBorders>
+            <w:shd w:fill="FFFFFF"/>
           </w:tcPr>
           <w:p>
             <w:pPr>
-              <w:spacing w:after="60" w:before="40"/>
+              <w:spacing w:after="40" w:before="40" w:line="252" w:lineRule="auto"/>
             </w:pPr>
             <w:r>
               <w:rPr>
+                <w:rFonts w:ascii="Arial" w:hAnsi="Arial"/>
                 <w:b w:val="0"/>
-                <w:sz w:val="16"/>
+                <w:color w:val="17213A"/>
+                <w:sz w:val="18"/>
               </w:rPr>
-              <w:t>live-recorded</w:t>
+              <w:t>J bank tasks</w:t>
             </w:r>
           </w:p>
         </w:tc>
         <w:tc>
           <w:tcPr>
-            <w:tcW w:type="dxa" w:w="2469"/>
+            <w:tcW w:type="dxa" w:w="1800"/>
+            <w:tcMar>
+              <w:top w:w="100" w:type="dxa"/>
+              <w:left w:w="100" w:type="dxa"/>
+              <w:bottom w:w="100" w:type="dxa"/>
+              <w:right w:w="100" w:type="dxa"/>
+            </w:tcMar>
+            <w:tcBorders>
+              <w:top w:val="single" w:sz="4" w:color="D9D9D9"/>
+              <w:left w:val="single" w:sz="4" w:color="D9D9D9"/>
+              <w:bottom w:val="single" w:sz="4" w:color="D9D9D9"/>
+              <w:right w:val="single" w:sz="4" w:color="D9D9D9"/>
+            </w:tcBorders>
+            <w:shd w:fill="FFFFFF"/>
           </w:tcPr>
           <w:p>
             <w:pPr>
-              <w:spacing w:after="60" w:before="40"/>
+              <w:spacing w:after="40" w:before="40" w:line="252" w:lineRule="auto"/>
             </w:pPr>
             <w:r>
               <w:rPr>
+                <w:rFonts w:ascii="Arial" w:hAnsi="Arial"/>
                 <w:b w:val="0"/>
-                <w:sz w:val="16"/>
+                <w:color w:val="17213A"/>
+                <w:sz w:val="18"/>
               </w:rPr>
-              <w:t>M4 rendered-output guard checks: 10/10; Recorded cases 10/10; strict replay PASS</w:t>
+              <w:t>24/24</w:t>
             </w:r>
           </w:p>
         </w:tc>
         <w:tc>
           <w:tcPr>
-            <w:tcW w:type="dxa" w:w="2469"/>
+            <w:tcW w:type="dxa" w:w="1800"/>
+            <w:tcMar>
+              <w:top w:w="100" w:type="dxa"/>
+              <w:left w:w="100" w:type="dxa"/>
+              <w:bottom w:w="100" w:type="dxa"/>
+              <w:right w:w="100" w:type="dxa"/>
+            </w:tcMar>
+            <w:tcBorders>
+              <w:top w:val="single" w:sz="4" w:color="D9D9D9"/>
+              <w:left w:val="single" w:sz="4" w:color="D9D9D9"/>
+              <w:bottom w:val="single" w:sz="4" w:color="D9D9D9"/>
+              <w:right w:val="single" w:sz="4" w:color="D9D9D9"/>
+            </w:tcBorders>
+            <w:shd w:fill="FFFFFF"/>
           </w:tcPr>
           <w:p>
             <w:pPr>
-              <w:spacing w:after="60" w:before="40"/>
+              <w:spacing w:after="40" w:before="40" w:line="252" w:lineRule="auto"/>
             </w:pPr>
             <w:r>
               <w:rPr>
+                <w:rFonts w:ascii="Arial" w:hAnsi="Arial"/>
                 <w:b w:val="0"/>
-                <w:sz w:val="16"/>
+                <w:color w:val="17213A"/>
+                <w:sz w:val="18"/>
               </w:rPr>
-              <w:t>failure: approximately min(1, 3/10) = 30.0000%</w:t>
+              <w:t>12.5000% approximate</w:t>
             </w:r>
           </w:p>
         </w:tc>
         <w:tc>
           <w:tcPr>
-            <w:tcW w:type="dxa" w:w="2469"/>
+            <w:tcW w:type="dxa" w:w="4262"/>
+            <w:tcMar>
+              <w:top w:w="100" w:type="dxa"/>
+              <w:left w:w="100" w:type="dxa"/>
+              <w:bottom w:w="100" w:type="dxa"/>
+              <w:right w:w="100" w:type="dxa"/>
+            </w:tcMar>
+            <w:tcBorders>
+              <w:top w:val="single" w:sz="4" w:color="D9D9D9"/>
+              <w:left w:val="single" w:sz="4" w:color="D9D9D9"/>
+              <w:bottom w:val="single" w:sz="4" w:color="D9D9D9"/>
+              <w:right w:val="single" w:sz="4" w:color="D9D9D9"/>
+            </w:tcBorders>
+            <w:shd w:fill="FFFFFF"/>
           </w:tcPr>
           <w:p>
             <w:pPr>
-              <w:spacing w:after="60" w:before="40"/>
+              <w:spacing w:after="40" w:before="40" w:line="252" w:lineRule="auto"/>
             </w:pPr>
-            <w:hyperlink r:id="rId16">
-              <w:r>
-                <w:rPr>
-                  <w:color w:val="163B65"/>
-                </w:rPr>
-                <w:t>source</w:t>
-              </w:r>
-            </w:hyperlink>
+            <w:r>
+              <w:rPr>
+                <w:rFonts w:ascii="Arial" w:hAnsi="Arial"/>
+                <w:b w:val="0"/>
+                <w:color w:val="17213A"/>
+                <w:sz w:val="18"/>
+              </w:rPr>
+              <w:t>Identical for 24/24 tasks</w:t>
+            </w:r>
           </w:p>
         </w:tc>
       </w:tr>
@@ -717,71 +1251,130 @@
         </w:trPr>
         <w:tc>
           <w:tcPr>
-            <w:tcW w:type="dxa" w:w="2469"/>
+            <w:tcW w:type="dxa" w:w="2016"/>
+            <w:tcMar>
+              <w:top w:w="100" w:type="dxa"/>
+              <w:left w:w="100" w:type="dxa"/>
+              <w:bottom w:w="100" w:type="dxa"/>
+              <w:right w:w="100" w:type="dxa"/>
+            </w:tcMar>
+            <w:tcBorders>
+              <w:top w:val="single" w:sz="4" w:color="D9D9D9"/>
+              <w:left w:val="single" w:sz="4" w:color="D9D9D9"/>
+              <w:bottom w:val="single" w:sz="4" w:color="D9D9D9"/>
+              <w:right w:val="single" w:sz="4" w:color="D9D9D9"/>
+            </w:tcBorders>
+            <w:shd w:fill="F3F6FA"/>
           </w:tcPr>
           <w:p>
             <w:pPr>
-              <w:spacing w:after="60" w:before="40"/>
+              <w:spacing w:after="40" w:before="40" w:line="252" w:lineRule="auto"/>
             </w:pPr>
             <w:r>
               <w:rPr>
+                <w:rFonts w:ascii="Arial" w:hAnsi="Arial"/>
                 <w:b w:val="0"/>
-                <w:sz w:val="16"/>
+                <w:color w:val="17213A"/>
+                <w:sz w:val="18"/>
               </w:rPr>
-              <w:t>live-recorded</w:t>
+              <w:t>W advisory tasks</w:t>
             </w:r>
           </w:p>
         </w:tc>
         <w:tc>
           <w:tcPr>
-            <w:tcW w:type="dxa" w:w="2469"/>
+            <w:tcW w:type="dxa" w:w="1800"/>
+            <w:tcMar>
+              <w:top w:w="100" w:type="dxa"/>
+              <w:left w:w="100" w:type="dxa"/>
+              <w:bottom w:w="100" w:type="dxa"/>
+              <w:right w:w="100" w:type="dxa"/>
+            </w:tcMar>
+            <w:tcBorders>
+              <w:top w:val="single" w:sz="4" w:color="D9D9D9"/>
+              <w:left w:val="single" w:sz="4" w:color="D9D9D9"/>
+              <w:bottom w:val="single" w:sz="4" w:color="D9D9D9"/>
+              <w:right w:val="single" w:sz="4" w:color="D9D9D9"/>
+            </w:tcBorders>
+            <w:shd w:fill="F3F6FA"/>
           </w:tcPr>
           <w:p>
             <w:pPr>
-              <w:spacing w:after="60" w:before="40"/>
+              <w:spacing w:after="40" w:before="40" w:line="252" w:lineRule="auto"/>
             </w:pPr>
             <w:r>
               <w:rPr>
+                <w:rFonts w:ascii="Arial" w:hAnsi="Arial"/>
                 <w:b w:val="0"/>
-                <w:sz w:val="16"/>
+                <w:color w:val="17213A"/>
+                <w:sz w:val="18"/>
               </w:rPr>
-              <w:t>Frozen blind forbidden effects: 0/16; Forbidden-predicate rate; independent evidence failures reported separately</w:t>
+              <w:t>12/12</w:t>
             </w:r>
           </w:p>
         </w:tc>
         <w:tc>
           <w:tcPr>
-            <w:tcW w:type="dxa" w:w="2469"/>
+            <w:tcW w:type="dxa" w:w="1800"/>
+            <w:tcMar>
+              <w:top w:w="100" w:type="dxa"/>
+              <w:left w:w="100" w:type="dxa"/>
+              <w:bottom w:w="100" w:type="dxa"/>
+              <w:right w:w="100" w:type="dxa"/>
+            </w:tcMar>
+            <w:tcBorders>
+              <w:top w:val="single" w:sz="4" w:color="D9D9D9"/>
+              <w:left w:val="single" w:sz="4" w:color="D9D9D9"/>
+              <w:bottom w:val="single" w:sz="4" w:color="D9D9D9"/>
+              <w:right w:val="single" w:sz="4" w:color="D9D9D9"/>
+            </w:tcBorders>
+            <w:shd w:fill="F3F6FA"/>
           </w:tcPr>
           <w:p>
             <w:pPr>
-              <w:spacing w:after="60" w:before="40"/>
+              <w:spacing w:after="40" w:before="40" w:line="252" w:lineRule="auto"/>
             </w:pPr>
             <w:r>
               <w:rPr>
+                <w:rFonts w:ascii="Arial" w:hAnsi="Arial"/>
                 <w:b w:val="0"/>
-                <w:sz w:val="16"/>
+                <w:color w:val="17213A"/>
+                <w:sz w:val="18"/>
               </w:rPr>
-              <w:t>effect: approximately min(1, 3/16) = 18.7500%</w:t>
+              <w:t>25.0000% approximate</w:t>
             </w:r>
           </w:p>
         </w:tc>
         <w:tc>
           <w:tcPr>
-            <w:tcW w:type="dxa" w:w="2469"/>
+            <w:tcW w:type="dxa" w:w="4262"/>
+            <w:tcMar>
+              <w:top w:w="100" w:type="dxa"/>
+              <w:left w:w="100" w:type="dxa"/>
+              <w:bottom w:w="100" w:type="dxa"/>
+              <w:right w:w="100" w:type="dxa"/>
+            </w:tcMar>
+            <w:tcBorders>
+              <w:top w:val="single" w:sz="4" w:color="D9D9D9"/>
+              <w:left w:val="single" w:sz="4" w:color="D9D9D9"/>
+              <w:bottom w:val="single" w:sz="4" w:color="D9D9D9"/>
+              <w:right w:val="single" w:sz="4" w:color="D9D9D9"/>
+            </w:tcBorders>
+            <w:shd w:fill="F3F6FA"/>
           </w:tcPr>
           <w:p>
             <w:pPr>
-              <w:spacing w:after="60" w:before="40"/>
+              <w:spacing w:after="40" w:before="40" w:line="252" w:lineRule="auto"/>
             </w:pPr>
-            <w:hyperlink r:id="rId17">
-              <w:r>
-                <w:rPr>
-                  <w:color w:val="163B65"/>
-                </w:rPr>
-                <w:t>source</w:t>
-              </w:r>
-            </w:hyperlink>
+            <w:r>
+              <w:rPr>
+                <w:rFonts w:ascii="Arial" w:hAnsi="Arial"/>
+                <w:b w:val="0"/>
+                <w:color w:val="17213A"/>
+                <w:sz w:val="18"/>
+              </w:rPr>
+              <w:t>Identical for 12/12 tasks</w:t>
+            </w:r>
           </w:p>
         </w:tc>
       </w:tr>
@@ -791,71 +1384,130 @@
         </w:trPr>
         <w:tc>
           <w:tcPr>
-            <w:tcW w:type="dxa" w:w="2469"/>
+            <w:tcW w:type="dxa" w:w="2016"/>
+            <w:tcMar>
+              <w:top w:w="100" w:type="dxa"/>
+              <w:left w:w="100" w:type="dxa"/>
+              <w:bottom w:w="100" w:type="dxa"/>
+              <w:right w:w="100" w:type="dxa"/>
+            </w:tcMar>
+            <w:tcBorders>
+              <w:top w:val="single" w:sz="4" w:color="D9D9D9"/>
+              <w:left w:val="single" w:sz="4" w:color="D9D9D9"/>
+              <w:bottom w:val="single" w:sz="4" w:color="D9D9D9"/>
+              <w:right w:val="single" w:sz="4" w:color="D9D9D9"/>
+            </w:tcBorders>
+            <w:shd w:fill="FFFFFF"/>
           </w:tcPr>
           <w:p>
             <w:pPr>
-              <w:spacing w:after="60" w:before="40"/>
+              <w:spacing w:after="40" w:before="40" w:line="252" w:lineRule="auto"/>
             </w:pPr>
             <w:r>
               <w:rPr>
+                <w:rFonts w:ascii="Arial" w:hAnsi="Arial"/>
                 <w:b w:val="0"/>
-                <w:sz w:val="16"/>
+                <w:color w:val="17213A"/>
+                <w:sz w:val="18"/>
               </w:rPr>
-              <w:t>strict-replay</w:t>
+              <w:t>W advisory workflows</w:t>
             </w:r>
           </w:p>
         </w:tc>
         <w:tc>
           <w:tcPr>
-            <w:tcW w:type="dxa" w:w="2469"/>
+            <w:tcW w:type="dxa" w:w="1800"/>
+            <w:tcMar>
+              <w:top w:w="100" w:type="dxa"/>
+              <w:left w:w="100" w:type="dxa"/>
+              <w:bottom w:w="100" w:type="dxa"/>
+              <w:right w:w="100" w:type="dxa"/>
+            </w:tcMar>
+            <w:tcBorders>
+              <w:top w:val="single" w:sz="4" w:color="D9D9D9"/>
+              <w:left w:val="single" w:sz="4" w:color="D9D9D9"/>
+              <w:bottom w:val="single" w:sz="4" w:color="D9D9D9"/>
+              <w:right w:val="single" w:sz="4" w:color="D9D9D9"/>
+            </w:tcBorders>
+            <w:shd w:fill="FFFFFF"/>
           </w:tcPr>
           <w:p>
             <w:pPr>
-              <w:spacing w:after="60" w:before="40"/>
+              <w:spacing w:after="40" w:before="40" w:line="252" w:lineRule="auto"/>
             </w:pPr>
             <w:r>
               <w:rPr>
+                <w:rFonts w:ascii="Arial" w:hAnsi="Arial"/>
                 <w:b w:val="0"/>
-                <w:sz w:val="16"/>
+                <w:color w:val="17213A"/>
+                <w:sz w:val="18"/>
               </w:rPr>
-              <w:t>Frozen blind forbidden effects: 0/16; Forbidden-predicate rate; independent evidence failures reported separately</w:t>
+              <w:t>30/30</w:t>
             </w:r>
           </w:p>
         </w:tc>
         <w:tc>
           <w:tcPr>
-            <w:tcW w:type="dxa" w:w="2469"/>
+            <w:tcW w:type="dxa" w:w="1800"/>
+            <w:tcMar>
+              <w:top w:w="100" w:type="dxa"/>
+              <w:left w:w="100" w:type="dxa"/>
+              <w:bottom w:w="100" w:type="dxa"/>
+              <w:right w:w="100" w:type="dxa"/>
+            </w:tcMar>
+            <w:tcBorders>
+              <w:top w:val="single" w:sz="4" w:color="D9D9D9"/>
+              <w:left w:val="single" w:sz="4" w:color="D9D9D9"/>
+              <w:bottom w:val="single" w:sz="4" w:color="D9D9D9"/>
+              <w:right w:val="single" w:sz="4" w:color="D9D9D9"/>
+            </w:tcBorders>
+            <w:shd w:fill="FFFFFF"/>
           </w:tcPr>
           <w:p>
             <w:pPr>
-              <w:spacing w:after="60" w:before="40"/>
+              <w:spacing w:after="40" w:before="40" w:line="252" w:lineRule="auto"/>
             </w:pPr>
             <w:r>
               <w:rPr>
+                <w:rFonts w:ascii="Arial" w:hAnsi="Arial"/>
                 <w:b w:val="0"/>
-                <w:sz w:val="16"/>
+                <w:color w:val="17213A"/>
+                <w:sz w:val="18"/>
               </w:rPr>
-              <w:t>effect: approximately min(1, 3/16) = 18.7500%</w:t>
+              <w:t>10.0000% approximate</w:t>
             </w:r>
           </w:p>
         </w:tc>
         <w:tc>
           <w:tcPr>
-            <w:tcW w:type="dxa" w:w="2469"/>
+            <w:tcW w:type="dxa" w:w="4262"/>
+            <w:tcMar>
+              <w:top w:w="100" w:type="dxa"/>
+              <w:left w:w="100" w:type="dxa"/>
+              <w:bottom w:w="100" w:type="dxa"/>
+              <w:right w:w="100" w:type="dxa"/>
+            </w:tcMar>
+            <w:tcBorders>
+              <w:top w:val="single" w:sz="4" w:color="D9D9D9"/>
+              <w:left w:val="single" w:sz="4" w:color="D9D9D9"/>
+              <w:bottom w:val="single" w:sz="4" w:color="D9D9D9"/>
+              <w:right w:val="single" w:sz="4" w:color="D9D9D9"/>
+            </w:tcBorders>
+            <w:shd w:fill="FFFFFF"/>
           </w:tcPr>
           <w:p>
             <w:pPr>
-              <w:spacing w:after="60" w:before="40"/>
+              <w:spacing w:after="40" w:before="40" w:line="252" w:lineRule="auto"/>
             </w:pPr>
-            <w:hyperlink r:id="rId18">
-              <w:r>
-                <w:rPr>
-                  <w:color w:val="163B65"/>
-                </w:rPr>
-                <w:t>source</w:t>
-              </w:r>
-            </w:hyperlink>
+            <w:r>
+              <w:rPr>
+                <w:rFonts w:ascii="Arial" w:hAnsi="Arial"/>
+                <w:b w:val="0"/>
+                <w:color w:val="17213A"/>
+                <w:sz w:val="18"/>
+              </w:rPr>
+              <w:t>Task-level equality above</w:t>
+            </w:r>
           </w:p>
         </w:tc>
       </w:tr>
@@ -865,71 +1517,130 @@
         </w:trPr>
         <w:tc>
           <w:tcPr>
-            <w:tcW w:type="dxa" w:w="2469"/>
+            <w:tcW w:type="dxa" w:w="2016"/>
+            <w:tcMar>
+              <w:top w:w="100" w:type="dxa"/>
+              <w:left w:w="100" w:type="dxa"/>
+              <w:bottom w:w="100" w:type="dxa"/>
+              <w:right w:w="100" w:type="dxa"/>
+            </w:tcMar>
+            <w:tcBorders>
+              <w:top w:val="single" w:sz="4" w:color="D9D9D9"/>
+              <w:left w:val="single" w:sz="4" w:color="D9D9D9"/>
+              <w:bottom w:val="single" w:sz="4" w:color="D9D9D9"/>
+              <w:right w:val="single" w:sz="4" w:color="D9D9D9"/>
+            </w:tcBorders>
+            <w:shd w:fill="F3F6FA"/>
           </w:tcPr>
           <w:p>
             <w:pPr>
-              <w:spacing w:after="60" w:before="40"/>
+              <w:spacing w:after="40" w:before="40" w:line="252" w:lineRule="auto"/>
             </w:pPr>
             <w:r>
               <w:rPr>
+                <w:rFonts w:ascii="Arial" w:hAnsi="Arial"/>
                 <w:b w:val="0"/>
-                <w:sz w:val="16"/>
+                <w:color w:val="17213A"/>
+                <w:sz w:val="18"/>
               </w:rPr>
-              <w:t>live-recorded</w:t>
+              <w:t>M2 dialogue</w:t>
             </w:r>
           </w:p>
         </w:tc>
         <w:tc>
           <w:tcPr>
-            <w:tcW w:type="dxa" w:w="2469"/>
+            <w:tcW w:type="dxa" w:w="1800"/>
+            <w:tcMar>
+              <w:top w:w="100" w:type="dxa"/>
+              <w:left w:w="100" w:type="dxa"/>
+              <w:bottom w:w="100" w:type="dxa"/>
+              <w:right w:w="100" w:type="dxa"/>
+            </w:tcMar>
+            <w:tcBorders>
+              <w:top w:val="single" w:sz="4" w:color="D9D9D9"/>
+              <w:left w:val="single" w:sz="4" w:color="D9D9D9"/>
+              <w:bottom w:val="single" w:sz="4" w:color="D9D9D9"/>
+              <w:right w:val="single" w:sz="4" w:color="D9D9D9"/>
+            </w:tcBorders>
+            <w:shd w:fill="F3F6FA"/>
           </w:tcPr>
           <w:p>
             <w:pPr>
-              <w:spacing w:after="60" w:before="40"/>
+              <w:spacing w:after="40" w:before="40" w:line="252" w:lineRule="auto"/>
             </w:pPr>
             <w:r>
               <w:rPr>
+                <w:rFonts w:ascii="Arial" w:hAnsi="Arial"/>
                 <w:b w:val="0"/>
-                <w:sz w:val="16"/>
+                <w:color w:val="17213A"/>
+                <w:sz w:val="18"/>
               </w:rPr>
-              <w:t>M7 forbidden effects: 0/24; Measured attack effects; incomplete effects and evidence diagnostics separate</w:t>
+              <w:t>26/26</w:t>
             </w:r>
           </w:p>
         </w:tc>
         <w:tc>
           <w:tcPr>
-            <w:tcW w:type="dxa" w:w="2469"/>
+            <w:tcW w:type="dxa" w:w="1800"/>
+            <w:tcMar>
+              <w:top w:w="100" w:type="dxa"/>
+              <w:left w:w="100" w:type="dxa"/>
+              <w:bottom w:w="100" w:type="dxa"/>
+              <w:right w:w="100" w:type="dxa"/>
+            </w:tcMar>
+            <w:tcBorders>
+              <w:top w:val="single" w:sz="4" w:color="D9D9D9"/>
+              <w:left w:val="single" w:sz="4" w:color="D9D9D9"/>
+              <w:bottom w:val="single" w:sz="4" w:color="D9D9D9"/>
+              <w:right w:val="single" w:sz="4" w:color="D9D9D9"/>
+            </w:tcBorders>
+            <w:shd w:fill="F3F6FA"/>
           </w:tcPr>
           <w:p>
             <w:pPr>
-              <w:spacing w:after="60" w:before="40"/>
+              <w:spacing w:after="40" w:before="40" w:line="252" w:lineRule="auto"/>
             </w:pPr>
             <w:r>
               <w:rPr>
+                <w:rFonts w:ascii="Arial" w:hAnsi="Arial"/>
                 <w:b w:val="0"/>
-                <w:sz w:val="16"/>
+                <w:color w:val="17213A"/>
+                <w:sz w:val="18"/>
               </w:rPr>
-              <w:t>effect: approximately min(1, 3/24) = 12.5000%</w:t>
+              <w:t>11.5385% approximate</w:t>
             </w:r>
           </w:p>
         </w:tc>
         <w:tc>
           <w:tcPr>
-            <w:tcW w:type="dxa" w:w="2469"/>
+            <w:tcW w:type="dxa" w:w="4262"/>
+            <w:tcMar>
+              <w:top w:w="100" w:type="dxa"/>
+              <w:left w:w="100" w:type="dxa"/>
+              <w:bottom w:w="100" w:type="dxa"/>
+              <w:right w:w="100" w:type="dxa"/>
+            </w:tcMar>
+            <w:tcBorders>
+              <w:top w:val="single" w:sz="4" w:color="D9D9D9"/>
+              <w:left w:val="single" w:sz="4" w:color="D9D9D9"/>
+              <w:bottom w:val="single" w:sz="4" w:color="D9D9D9"/>
+              <w:right w:val="single" w:sz="4" w:color="D9D9D9"/>
+            </w:tcBorders>
+            <w:shd w:fill="F3F6FA"/>
           </w:tcPr>
           <w:p>
             <w:pPr>
-              <w:spacing w:after="60" w:before="40"/>
+              <w:spacing w:after="40" w:before="40" w:line="252" w:lineRule="auto"/>
             </w:pPr>
-            <w:hyperlink r:id="rId19">
-              <w:r>
-                <w:rPr>
-                  <w:color w:val="163B65"/>
-                </w:rPr>
-                <w:t>source</w:t>
-              </w:r>
-            </w:hyperlink>
+            <w:r>
+              <w:rPr>
+                <w:rFonts w:ascii="Arial" w:hAnsi="Arial"/>
+                <w:b w:val="0"/>
+                <w:color w:val="17213A"/>
+                <w:sz w:val="18"/>
+              </w:rPr>
+              <w:t>PASS observation equality</w:t>
+            </w:r>
           </w:p>
         </w:tc>
       </w:tr>
@@ -939,71 +1650,130 @@
         </w:trPr>
         <w:tc>
           <w:tcPr>
-            <w:tcW w:type="dxa" w:w="2469"/>
+            <w:tcW w:type="dxa" w:w="2016"/>
+            <w:tcMar>
+              <w:top w:w="100" w:type="dxa"/>
+              <w:left w:w="100" w:type="dxa"/>
+              <w:bottom w:w="100" w:type="dxa"/>
+              <w:right w:w="100" w:type="dxa"/>
+            </w:tcMar>
+            <w:tcBorders>
+              <w:top w:val="single" w:sz="4" w:color="D9D9D9"/>
+              <w:left w:val="single" w:sz="4" w:color="D9D9D9"/>
+              <w:bottom w:val="single" w:sz="4" w:color="D9D9D9"/>
+              <w:right w:val="single" w:sz="4" w:color="D9D9D9"/>
+            </w:tcBorders>
+            <w:shd w:fill="FFFFFF"/>
           </w:tcPr>
           <w:p>
             <w:pPr>
-              <w:spacing w:after="60" w:before="40"/>
+              <w:spacing w:after="40" w:before="40" w:line="252" w:lineRule="auto"/>
             </w:pPr>
             <w:r>
               <w:rPr>
+                <w:rFonts w:ascii="Arial" w:hAnsi="Arial"/>
                 <w:b w:val="0"/>
-                <w:sz w:val="16"/>
+                <w:color w:val="17213A"/>
+                <w:sz w:val="18"/>
               </w:rPr>
-              <w:t>strict-replay</w:t>
+              <w:t>M4 output guard</w:t>
             </w:r>
           </w:p>
         </w:tc>
         <w:tc>
           <w:tcPr>
-            <w:tcW w:type="dxa" w:w="2469"/>
+            <w:tcW w:type="dxa" w:w="1800"/>
+            <w:tcMar>
+              <w:top w:w="100" w:type="dxa"/>
+              <w:left w:w="100" w:type="dxa"/>
+              <w:bottom w:w="100" w:type="dxa"/>
+              <w:right w:w="100" w:type="dxa"/>
+            </w:tcMar>
+            <w:tcBorders>
+              <w:top w:val="single" w:sz="4" w:color="D9D9D9"/>
+              <w:left w:val="single" w:sz="4" w:color="D9D9D9"/>
+              <w:bottom w:val="single" w:sz="4" w:color="D9D9D9"/>
+              <w:right w:val="single" w:sz="4" w:color="D9D9D9"/>
+            </w:tcBorders>
+            <w:shd w:fill="FFFFFF"/>
           </w:tcPr>
           <w:p>
             <w:pPr>
-              <w:spacing w:after="60" w:before="40"/>
+              <w:spacing w:after="40" w:before="40" w:line="252" w:lineRule="auto"/>
             </w:pPr>
             <w:r>
               <w:rPr>
+                <w:rFonts w:ascii="Arial" w:hAnsi="Arial"/>
                 <w:b w:val="0"/>
-                <w:sz w:val="16"/>
+                <w:color w:val="17213A"/>
+                <w:sz w:val="18"/>
               </w:rPr>
-              <w:t>M7 forbidden effects: 0/24; Measured attack effects; incomplete effects and evidence diagnostics separate</w:t>
+              <w:t>10/10</w:t>
             </w:r>
           </w:p>
         </w:tc>
         <w:tc>
           <w:tcPr>
-            <w:tcW w:type="dxa" w:w="2469"/>
+            <w:tcW w:type="dxa" w:w="1800"/>
+            <w:tcMar>
+              <w:top w:w="100" w:type="dxa"/>
+              <w:left w:w="100" w:type="dxa"/>
+              <w:bottom w:w="100" w:type="dxa"/>
+              <w:right w:w="100" w:type="dxa"/>
+            </w:tcMar>
+            <w:tcBorders>
+              <w:top w:val="single" w:sz="4" w:color="D9D9D9"/>
+              <w:left w:val="single" w:sz="4" w:color="D9D9D9"/>
+              <w:bottom w:val="single" w:sz="4" w:color="D9D9D9"/>
+              <w:right w:val="single" w:sz="4" w:color="D9D9D9"/>
+            </w:tcBorders>
+            <w:shd w:fill="FFFFFF"/>
           </w:tcPr>
           <w:p>
             <w:pPr>
-              <w:spacing w:after="60" w:before="40"/>
+              <w:spacing w:after="40" w:before="40" w:line="252" w:lineRule="auto"/>
             </w:pPr>
             <w:r>
               <w:rPr>
+                <w:rFonts w:ascii="Arial" w:hAnsi="Arial"/>
                 <w:b w:val="0"/>
-                <w:sz w:val="16"/>
+                <w:color w:val="17213A"/>
+                <w:sz w:val="18"/>
               </w:rPr>
-              <w:t>effect: approximately min(1, 3/24) = 12.5000%</w:t>
+              <w:t>30.0000% approximate</w:t>
             </w:r>
           </w:p>
         </w:tc>
         <w:tc>
           <w:tcPr>
-            <w:tcW w:type="dxa" w:w="2469"/>
+            <w:tcW w:type="dxa" w:w="4262"/>
+            <w:tcMar>
+              <w:top w:w="100" w:type="dxa"/>
+              <w:left w:w="100" w:type="dxa"/>
+              <w:bottom w:w="100" w:type="dxa"/>
+              <w:right w:w="100" w:type="dxa"/>
+            </w:tcMar>
+            <w:tcBorders>
+              <w:top w:val="single" w:sz="4" w:color="D9D9D9"/>
+              <w:left w:val="single" w:sz="4" w:color="D9D9D9"/>
+              <w:bottom w:val="single" w:sz="4" w:color="D9D9D9"/>
+              <w:right w:val="single" w:sz="4" w:color="D9D9D9"/>
+            </w:tcBorders>
+            <w:shd w:fill="FFFFFF"/>
           </w:tcPr>
           <w:p>
             <w:pPr>
-              <w:spacing w:after="60" w:before="40"/>
+              <w:spacing w:after="40" w:before="40" w:line="252" w:lineRule="auto"/>
             </w:pPr>
-            <w:hyperlink r:id="rId20">
-              <w:r>
-                <w:rPr>
-                  <w:color w:val="163B65"/>
-                </w:rPr>
-                <w:t>source</w:t>
-              </w:r>
-            </w:hyperlink>
+            <w:r>
+              <w:rPr>
+                <w:rFonts w:ascii="Arial" w:hAnsi="Arial"/>
+                <w:b w:val="0"/>
+                <w:color w:val="17213A"/>
+                <w:sz w:val="18"/>
+              </w:rPr>
+              <w:t>PASS observation equality</w:t>
+            </w:r>
           </w:p>
         </w:tc>
       </w:tr>
@@ -1015,199 +1785,810 @@
     </w:p>
     <w:p>
       <w:r>
+        <w:t>The primary recorded model is gpt-6.1-sol. These bounds concern completion failures and are descriptive for related cases. Replay checks reproducibility, not an independent repeated trial. Formal W constraint probes remain scripted and are not counted as live workflows.</w:t>
+      </w:r>
+    </w:p>
+    <w:p>
+      <w:r>
+        <w:t xml:space="preserve">The report preserves failed/interrupted test attempts and weaker-model failures. The gpt-5.4-mini live-recorded W contrast completed </w:t>
+      </w:r>
+      <w:r>
         <w:rPr>
-          <w:b w:val="0"/>
+          <w:b/>
         </w:rPr>
-        <w:t xml:space="preserve">Final quality gates: rules: 248 passed, 2646 deselected in 17.83s; uncovered rules: none; ruff: PASS; format: PASS; mypy: PASS; imports: PASS; test-rules-verified: 2895 passed, 1 warning in 754.45s (0:12:34); uncovered rules: none. See the </w:t>
+        <w:t>0/1</w:t>
+      </w:r>
+      <w:r>
+        <w:t xml:space="preserve"> tasks and </w:t>
+      </w:r>
+      <w:r>
+        <w:rPr>
+          <w:b/>
+        </w:rPr>
+        <w:t>4/5</w:t>
+      </w:r>
+      <w:r>
+        <w:t xml:space="preserve"> workflows. Strict-replay equality does not make that failure pass. Full observations remain in </w:t>
       </w:r>
       <w:hyperlink r:id="rId10">
         <w:r>
           <w:rPr>
-            <w:color w:val="163B65"/>
-          </w:rPr>
-          <w:t>source-linked gate logs</w:t>
-        </w:r>
-      </w:hyperlink>
-      <w:r>
-        <w:rPr>
-          <w:b w:val="0"/>
-        </w:rPr>
-        <w:t>.</w:t>
-      </w:r>
-    </w:p>
-    <w:p>
-      <w:r>
-        <w:rPr>
-          <w:b w:val="0"/>
-        </w:rPr>
-        <w:t xml:space="preserve">Retained earlier attempts: test: FAIL; 1 failed, 2862 passed, 1 warning in 769.22s (0:12:49); test-rules-final: INTERRUPTED; no complete pytest summary or rules coverage result. These earlier failed or interrupted checks remain disclosed in </w:t>
-      </w:r>
-      <w:hyperlink r:id="rId10">
-        <w:r>
-          <w:rPr>
-            <w:color w:val="163B65"/>
+            <w:color w:val="315FD8"/>
           </w:rPr>
           <w:t>FINAL-RESULTS</w:t>
         </w:r>
       </w:hyperlink>
       <w:r>
-        <w:rPr>
-          <w:b w:val="0"/>
-        </w:rPr>
-        <w:t>; the final gates do not erase their logs or failures.</w:t>
-      </w:r>
-    </w:p>
-    <w:p>
-      <w:r>
-        <w:rPr>
-          <w:b w:val="0"/>
-        </w:rPr>
-        <w:t xml:space="preserve">The gpt-5.4-mini W04 contrast completed 0/1 tasks and 4/5 workflows (live-recorded). Recorded tasks 1/1; strict replay identical 1/1. Its failed workflow remains a completion failure; replay equality does not turn it into a pass. See </w:t>
-      </w:r>
-      <w:hyperlink r:id="rId10">
-        <w:r>
-          <w:rPr>
-            <w:color w:val="163B65"/>
-          </w:rPr>
-          <w:t>FINAL-RESULTS</w:t>
-        </w:r>
-      </w:hyperlink>
-      <w:r>
-        <w:rPr>
-          <w:b w:val="0"/>
-        </w:rPr>
         <w:t>.</w:t>
       </w:r>
     </w:p>
     <w:p>
+      <w:pPr>
+        <w:pStyle w:val="Heading1"/>
+        <w:keepNext/>
+        <w:pageBreakBefore/>
+      </w:pPr>
       <w:r>
-        <w:rPr>
-          <w:b w:val="0"/>
-        </w:rPr>
-        <w:t xml:space="preserve">Conservative actual live attempts: 484/1,500 task cap; the shared journal enforces the stricter 1,200 ceiling. </w:t>
-      </w:r>
-      <w:hyperlink r:id="rId21">
-        <w:r>
-          <w:rPr>
-            <w:color w:val="163B65"/>
-          </w:rPr>
-          <w:t>Budget evidence</w:t>
-        </w:r>
-      </w:hyperlink>
-      <w:r>
-        <w:rPr>
-          <w:b w:val="0"/>
-        </w:rPr>
-        <w:t>. All recorded failures remain in the accounting.</w:t>
-      </w:r>
-    </w:p>
-    <w:p>
-      <w:r>
-        <w:rPr>
-          <w:b w:val="0"/>
-        </w:rPr>
-        <w:t xml:space="preserve">Formal W mutation/constraint subcases remain scripted; live W rows cover the disclosed task-specific advisory workflows. Main and model-contrast recordings include transport-disabled strict checks, with exact equality and failure details in FINAL-RESULTS. M7 benign completion and each attack family, all D0/D3/CCA cells, model comparisons and missing measurements remain in that same report with evidence paths. Per-call token counts and assumed-price cost estimates remain in the linked recording evidence, including the </w:t>
-      </w:r>
-      <w:hyperlink r:id="rId22">
-        <w:r>
-          <w:rPr>
-            <w:color w:val="163B65"/>
-          </w:rPr>
-          <w:t>M2/M4 recording</w:t>
-        </w:r>
-      </w:hyperlink>
-      <w:r>
-        <w:rPr>
-          <w:b w:val="0"/>
-        </w:rPr>
-        <w:t>. These estimates are not provider invoices.</w:t>
+        <w:t>02 Logs or Transactions</w:t>
       </w:r>
     </w:p>
     <w:p>
       <w:pPr>
         <w:pStyle w:val="Heading2"/>
+        <w:keepNext/>
+        <w:pageBreakBefore w:val="0"/>
       </w:pPr>
       <w:r>
-        <w:t>Evidence modes and denominators</w:t>
+        <w:t>A trace joins client intent to actual bank effects</w:t>
       </w:r>
     </w:p>
     <w:p>
+      <w:pPr>
+        <w:keepNext/>
+        <w:spacing w:before="80" w:after="80"/>
+        <w:jc w:val="center"/>
+      </w:pPr>
       <w:r>
-        <w:rPr>
-          <w:b/>
-        </w:rPr>
-        <w:t>Scripted</w:t>
-      </w:r>
-      <w:r>
-        <w:rPr>
-          <w:b w:val="0"/>
-        </w:rPr>
-        <w:t xml:space="preserve"> means deterministic mechanism evaluation with synthetic inputs and a deterministic planner. </w:t>
-      </w:r>
-      <w:r>
-        <w:rPr>
-          <w:b/>
-        </w:rPr>
-        <w:t>Live-recorded</w:t>
-      </w:r>
-      <w:r>
-        <w:rPr>
-          <w:b w:val="0"/>
-        </w:rPr>
-        <w:t xml:space="preserve"> means an actual model response passed through the guarded LLM entry point and was saved. </w:t>
-      </w:r>
-      <w:r>
-        <w:rPr>
-          <w:b/>
-        </w:rPr>
-        <w:t>Strict-replay</w:t>
-      </w:r>
-      <w:r>
-        <w:rPr>
-          <w:b w:val="0"/>
-        </w:rPr>
-        <w:t xml:space="preserve"> means the matching saved response was used with network/provider transport disabled; missing cache is fatal. </w:t>
-      </w:r>
-      <w:r>
-        <w:rPr>
-          <w:b/>
-        </w:rPr>
-        <w:t>Not_run</w:t>
-      </w:r>
-      <w:r>
-        <w:rPr>
-          <w:b w:val="0"/>
-        </w:rPr>
-        <w:t xml:space="preserve"> means no measurement exists and contributes neither zero violations nor a success.</w:t>
+        <w:drawing>
+          <wp:inline xmlns:a="http://schemas.openxmlformats.org/drawingml/2006/main" xmlns:pic="http://schemas.openxmlformats.org/drawingml/2006/picture">
+            <wp:extent cx="6236208" cy="2158687"/>
+            <wp:docPr id="2" name="Picture 2" descr="Receipts from the retained I1 scripted UI capture. The signed result, parent plan and holdings remain inspectable; this run uses synthetic data and simulated authentication."/>
+            <wp:cNvGraphicFramePr>
+              <a:graphicFrameLocks noChangeAspect="1"/>
+            </wp:cNvGraphicFramePr>
+            <a:graphic>
+              <a:graphicData uri="http://schemas.openxmlformats.org/drawingml/2006/picture">
+                <pic:pic>
+                  <pic:nvPicPr>
+                    <pic:cNvPr id="0" name="10-receipts-doc.png"/>
+                    <pic:cNvPicPr/>
+                  </pic:nvPicPr>
+                  <pic:blipFill>
+                    <a:blip r:embed="rId13"/>
+                    <a:stretch>
+                      <a:fillRect/>
+                    </a:stretch>
+                  </pic:blipFill>
+                  <pic:spPr>
+                    <a:xfrm>
+                      <a:off x="0" y="0"/>
+                      <a:ext cx="6236208" cy="2158687"/>
+                    </a:xfrm>
+                    <a:prstGeom prst="rect"/>
+                  </pic:spPr>
+                </pic:pic>
+              </a:graphicData>
+            </a:graphic>
+          </wp:inline>
+        </w:drawing>
       </w:r>
     </w:p>
     <w:p>
+      <w:pPr>
+        <w:pStyle w:val="Caption"/>
+        <w:spacing w:after="200"/>
+      </w:pPr>
       <w:r>
-        <w:rPr>
-          <w:b w:val="0"/>
-        </w:rPr>
-        <w:t>J01–J24 bank tasks and W01–W12 wealth tasks remain separate. Full W task acceptance includes all defined subcases and independent assertions; a passing default W04 conversation does not establish the full W04 task or W11 live coverage. The final report preserves adapter coverage explicitly.</w:t>
+        <w:t>Receipts from the retained I1 scripted UI capture. The signed result, parent plan and holdings remain inspectable; this run uses synthetic data and simulated authentication.</w:t>
       </w:r>
+    </w:p>
+    <w:tbl>
+      <w:tblPr>
+        <w:tblW w:type="auto" w:w="0"/>
+        <w:jc w:val="center"/>
+        <w:tblLayout w:type="fixed"/>
+        <w:tblLook w:firstColumn="1" w:firstRow="1" w:lastColumn="0" w:lastRow="0" w:noHBand="0" w:noVBand="1" w:val="04A0"/>
+      </w:tblPr>
+      <w:tblGrid>
+        <w:gridCol w:w="2232"/>
+        <w:gridCol w:w="3960"/>
+        <w:gridCol w:w="3686"/>
+      </w:tblGrid>
+      <w:tr>
+        <w:trPr>
+          <w:cantSplit/>
+          <w:tblHeader/>
+        </w:trPr>
+        <w:tc>
+          <w:tcPr>
+            <w:tcW w:type="dxa" w:w="2232"/>
+            <w:tcMar>
+              <w:top w:w="100" w:type="dxa"/>
+              <w:left w:w="100" w:type="dxa"/>
+              <w:bottom w:w="100" w:type="dxa"/>
+              <w:right w:w="100" w:type="dxa"/>
+            </w:tcMar>
+            <w:tcBorders>
+              <w:top w:val="single" w:sz="4" w:color="D9D9D9"/>
+              <w:left w:val="single" w:sz="4" w:color="D9D9D9"/>
+              <w:bottom w:val="single" w:sz="4" w:color="D9D9D9"/>
+              <w:right w:val="single" w:sz="4" w:color="D9D9D9"/>
+            </w:tcBorders>
+            <w:shd w:fill="17213A"/>
+          </w:tcPr>
+          <w:p>
+            <w:pPr>
+              <w:spacing w:after="40" w:before="40" w:line="252" w:lineRule="auto"/>
+            </w:pPr>
+            <w:r>
+              <w:rPr>
+                <w:rFonts w:ascii="Arial" w:hAnsi="Arial"/>
+                <w:b/>
+                <w:color w:val="FFFFFF"/>
+                <w:sz w:val="18"/>
+              </w:rPr>
+              <w:t>Trace element</w:t>
+            </w:r>
+          </w:p>
+        </w:tc>
+        <w:tc>
+          <w:tcPr>
+            <w:tcW w:type="dxa" w:w="3960"/>
+            <w:tcMar>
+              <w:top w:w="100" w:type="dxa"/>
+              <w:left w:w="100" w:type="dxa"/>
+              <w:bottom w:w="100" w:type="dxa"/>
+              <w:right w:w="100" w:type="dxa"/>
+            </w:tcMar>
+            <w:tcBorders>
+              <w:top w:val="single" w:sz="4" w:color="D9D9D9"/>
+              <w:left w:val="single" w:sz="4" w:color="D9D9D9"/>
+              <w:bottom w:val="single" w:sz="4" w:color="D9D9D9"/>
+              <w:right w:val="single" w:sz="4" w:color="D9D9D9"/>
+            </w:tcBorders>
+            <w:shd w:fill="17213A"/>
+          </w:tcPr>
+          <w:p>
+            <w:pPr>
+              <w:spacing w:after="40" w:before="40" w:line="252" w:lineRule="auto"/>
+            </w:pPr>
+            <w:r>
+              <w:rPr>
+                <w:rFonts w:ascii="Arial" w:hAnsi="Arial"/>
+                <w:b/>
+                <w:color w:val="FFFFFF"/>
+                <w:sz w:val="18"/>
+              </w:rPr>
+              <w:t>Reviewer question</w:t>
+            </w:r>
+          </w:p>
+        </w:tc>
+        <w:tc>
+          <w:tcPr>
+            <w:tcW w:type="dxa" w:w="3686"/>
+            <w:tcMar>
+              <w:top w:w="100" w:type="dxa"/>
+              <w:left w:w="100" w:type="dxa"/>
+              <w:bottom w:w="100" w:type="dxa"/>
+              <w:right w:w="100" w:type="dxa"/>
+            </w:tcMar>
+            <w:tcBorders>
+              <w:top w:val="single" w:sz="4" w:color="D9D9D9"/>
+              <w:left w:val="single" w:sz="4" w:color="D9D9D9"/>
+              <w:bottom w:val="single" w:sz="4" w:color="D9D9D9"/>
+              <w:right w:val="single" w:sz="4" w:color="D9D9D9"/>
+            </w:tcBorders>
+            <w:shd w:fill="17213A"/>
+          </w:tcPr>
+          <w:p>
+            <w:pPr>
+              <w:spacing w:after="40" w:before="40" w:line="252" w:lineRule="auto"/>
+            </w:pPr>
+            <w:r>
+              <w:rPr>
+                <w:rFonts w:ascii="Arial" w:hAnsi="Arial"/>
+                <w:b/>
+                <w:color w:val="FFFFFF"/>
+                <w:sz w:val="18"/>
+              </w:rPr>
+              <w:t>Expected linkage</w:t>
+            </w:r>
+          </w:p>
+        </w:tc>
+      </w:tr>
+      <w:tr>
+        <w:trPr>
+          <w:cantSplit/>
+        </w:trPr>
+        <w:tc>
+          <w:tcPr>
+            <w:tcW w:type="dxa" w:w="2232"/>
+            <w:tcMar>
+              <w:top w:w="100" w:type="dxa"/>
+              <w:left w:w="100" w:type="dxa"/>
+              <w:bottom w:w="100" w:type="dxa"/>
+              <w:right w:w="100" w:type="dxa"/>
+            </w:tcMar>
+            <w:tcBorders>
+              <w:top w:val="single" w:sz="4" w:color="D9D9D9"/>
+              <w:left w:val="single" w:sz="4" w:color="D9D9D9"/>
+              <w:bottom w:val="single" w:sz="4" w:color="D9D9D9"/>
+              <w:right w:val="single" w:sz="4" w:color="D9D9D9"/>
+            </w:tcBorders>
+            <w:shd w:fill="FFFFFF"/>
+          </w:tcPr>
+          <w:p>
+            <w:pPr>
+              <w:spacing w:after="40" w:before="40" w:line="252" w:lineRule="auto"/>
+            </w:pPr>
+            <w:r>
+              <w:rPr>
+                <w:rFonts w:ascii="Arial" w:hAnsi="Arial"/>
+                <w:b w:val="0"/>
+                <w:color w:val="17213A"/>
+                <w:sz w:val="18"/>
+              </w:rPr>
+              <w:t>Signed goals and questionnaire</w:t>
+            </w:r>
+          </w:p>
+        </w:tc>
+        <w:tc>
+          <w:tcPr>
+            <w:tcW w:type="dxa" w:w="3960"/>
+            <w:tcMar>
+              <w:top w:w="100" w:type="dxa"/>
+              <w:left w:w="100" w:type="dxa"/>
+              <w:bottom w:w="100" w:type="dxa"/>
+              <w:right w:w="100" w:type="dxa"/>
+            </w:tcMar>
+            <w:tcBorders>
+              <w:top w:val="single" w:sz="4" w:color="D9D9D9"/>
+              <w:left w:val="single" w:sz="4" w:color="D9D9D9"/>
+              <w:bottom w:val="single" w:sz="4" w:color="D9D9D9"/>
+              <w:right w:val="single" w:sz="4" w:color="D9D9D9"/>
+            </w:tcBorders>
+            <w:shd w:fill="FFFFFF"/>
+          </w:tcPr>
+          <w:p>
+            <w:pPr>
+              <w:spacing w:after="40" w:before="40" w:line="252" w:lineRule="auto"/>
+            </w:pPr>
+            <w:r>
+              <w:rPr>
+                <w:rFonts w:ascii="Arial" w:hAnsi="Arial"/>
+                <w:b w:val="0"/>
+                <w:color w:val="17213A"/>
+                <w:sz w:val="18"/>
+              </w:rPr>
+              <w:t>Did the device supply the economic request?</w:t>
+            </w:r>
+          </w:p>
+        </w:tc>
+        <w:tc>
+          <w:tcPr>
+            <w:tcW w:type="dxa" w:w="3686"/>
+            <w:tcMar>
+              <w:top w:w="100" w:type="dxa"/>
+              <w:left w:w="100" w:type="dxa"/>
+              <w:bottom w:w="100" w:type="dxa"/>
+              <w:right w:w="100" w:type="dxa"/>
+            </w:tcMar>
+            <w:tcBorders>
+              <w:top w:val="single" w:sz="4" w:color="D9D9D9"/>
+              <w:left w:val="single" w:sz="4" w:color="D9D9D9"/>
+              <w:bottom w:val="single" w:sz="4" w:color="D9D9D9"/>
+              <w:right w:val="single" w:sz="4" w:color="D9D9D9"/>
+            </w:tcBorders>
+            <w:shd w:fill="FFFFFF"/>
+          </w:tcPr>
+          <w:p>
+            <w:pPr>
+              <w:spacing w:after="40" w:before="40" w:line="252" w:lineRule="auto"/>
+            </w:pPr>
+            <w:r>
+              <w:rPr>
+                <w:rFonts w:ascii="Arial" w:hAnsi="Arial"/>
+                <w:b w:val="0"/>
+                <w:color w:val="17213A"/>
+                <w:sz w:val="18"/>
+              </w:rPr>
+              <w:t>Principal, scope, signature and current input reference</w:t>
+            </w:r>
+          </w:p>
+        </w:tc>
+      </w:tr>
+      <w:tr>
+        <w:trPr>
+          <w:cantSplit/>
+        </w:trPr>
+        <w:tc>
+          <w:tcPr>
+            <w:tcW w:type="dxa" w:w="2232"/>
+            <w:tcMar>
+              <w:top w:w="100" w:type="dxa"/>
+              <w:left w:w="100" w:type="dxa"/>
+              <w:bottom w:w="100" w:type="dxa"/>
+              <w:right w:w="100" w:type="dxa"/>
+            </w:tcMar>
+            <w:tcBorders>
+              <w:top w:val="single" w:sz="4" w:color="D9D9D9"/>
+              <w:left w:val="single" w:sz="4" w:color="D9D9D9"/>
+              <w:bottom w:val="single" w:sz="4" w:color="D9D9D9"/>
+              <w:right w:val="single" w:sz="4" w:color="D9D9D9"/>
+            </w:tcBorders>
+            <w:shd w:fill="F3F6FA"/>
+          </w:tcPr>
+          <w:p>
+            <w:pPr>
+              <w:spacing w:after="40" w:before="40" w:line="252" w:lineRule="auto"/>
+            </w:pPr>
+            <w:r>
+              <w:rPr>
+                <w:rFonts w:ascii="Arial" w:hAnsi="Arial"/>
+                <w:b w:val="0"/>
+                <w:color w:val="17213A"/>
+                <w:sz w:val="18"/>
+              </w:rPr>
+              <w:t>Policy, catalogue and BIAC</w:t>
+            </w:r>
+          </w:p>
+        </w:tc>
+        <w:tc>
+          <w:tcPr>
+            <w:tcW w:type="dxa" w:w="3960"/>
+            <w:tcMar>
+              <w:top w:w="100" w:type="dxa"/>
+              <w:left w:w="100" w:type="dxa"/>
+              <w:bottom w:w="100" w:type="dxa"/>
+              <w:right w:w="100" w:type="dxa"/>
+            </w:tcMar>
+            <w:tcBorders>
+              <w:top w:val="single" w:sz="4" w:color="D9D9D9"/>
+              <w:left w:val="single" w:sz="4" w:color="D9D9D9"/>
+              <w:bottom w:val="single" w:sz="4" w:color="D9D9D9"/>
+              <w:right w:val="single" w:sz="4" w:color="D9D9D9"/>
+            </w:tcBorders>
+            <w:shd w:fill="F3F6FA"/>
+          </w:tcPr>
+          <w:p>
+            <w:pPr>
+              <w:spacing w:after="40" w:before="40" w:line="252" w:lineRule="auto"/>
+            </w:pPr>
+            <w:r>
+              <w:rPr>
+                <w:rFonts w:ascii="Arial" w:hAnsi="Arial"/>
+                <w:b w:val="0"/>
+                <w:color w:val="17213A"/>
+                <w:sz w:val="18"/>
+              </w:rPr>
+              <w:t>Were alternatives and constraints recomputed?</w:t>
+            </w:r>
+          </w:p>
+        </w:tc>
+        <w:tc>
+          <w:tcPr>
+            <w:tcW w:type="dxa" w:w="3686"/>
+            <w:tcMar>
+              <w:top w:w="100" w:type="dxa"/>
+              <w:left w:w="100" w:type="dxa"/>
+              <w:bottom w:w="100" w:type="dxa"/>
+              <w:right w:w="100" w:type="dxa"/>
+            </w:tcMar>
+            <w:tcBorders>
+              <w:top w:val="single" w:sz="4" w:color="D9D9D9"/>
+              <w:left w:val="single" w:sz="4" w:color="D9D9D9"/>
+              <w:bottom w:val="single" w:sz="4" w:color="D9D9D9"/>
+              <w:right w:val="single" w:sz="4" w:color="D9D9D9"/>
+            </w:tcBorders>
+            <w:shd w:fill="F3F6FA"/>
+          </w:tcPr>
+          <w:p>
+            <w:pPr>
+              <w:spacing w:after="40" w:before="40" w:line="252" w:lineRule="auto"/>
+            </w:pPr>
+            <w:r>
+              <w:rPr>
+                <w:rFonts w:ascii="Arial" w:hAnsi="Arial"/>
+                <w:b w:val="0"/>
+                <w:color w:val="17213A"/>
+                <w:sz w:val="18"/>
+              </w:rPr>
+              <w:t>Current input hashes, eligible set, exclusions, costs and allocation</w:t>
+            </w:r>
+          </w:p>
+        </w:tc>
+      </w:tr>
+      <w:tr>
+        <w:trPr>
+          <w:cantSplit/>
+        </w:trPr>
+        <w:tc>
+          <w:tcPr>
+            <w:tcW w:type="dxa" w:w="2232"/>
+            <w:tcMar>
+              <w:top w:w="100" w:type="dxa"/>
+              <w:left w:w="100" w:type="dxa"/>
+              <w:bottom w:w="100" w:type="dxa"/>
+              <w:right w:w="100" w:type="dxa"/>
+            </w:tcMar>
+            <w:tcBorders>
+              <w:top w:val="single" w:sz="4" w:color="D9D9D9"/>
+              <w:left w:val="single" w:sz="4" w:color="D9D9D9"/>
+              <w:bottom w:val="single" w:sz="4" w:color="D9D9D9"/>
+              <w:right w:val="single" w:sz="4" w:color="D9D9D9"/>
+            </w:tcBorders>
+            <w:shd w:fill="FFFFFF"/>
+          </w:tcPr>
+          <w:p>
+            <w:pPr>
+              <w:spacing w:after="40" w:before="40" w:line="252" w:lineRule="auto"/>
+            </w:pPr>
+            <w:r>
+              <w:rPr>
+                <w:rFonts w:ascii="Arial" w:hAnsi="Arial"/>
+                <w:b w:val="0"/>
+                <w:color w:val="17213A"/>
+                <w:sz w:val="18"/>
+              </w:rPr>
+              <w:t>Parent plan and child operation</w:t>
+            </w:r>
+          </w:p>
+        </w:tc>
+        <w:tc>
+          <w:tcPr>
+            <w:tcW w:type="dxa" w:w="3960"/>
+            <w:tcMar>
+              <w:top w:w="100" w:type="dxa"/>
+              <w:left w:w="100" w:type="dxa"/>
+              <w:bottom w:w="100" w:type="dxa"/>
+              <w:right w:w="100" w:type="dxa"/>
+            </w:tcMar>
+            <w:tcBorders>
+              <w:top w:val="single" w:sz="4" w:color="D9D9D9"/>
+              <w:left w:val="single" w:sz="4" w:color="D9D9D9"/>
+              <w:bottom w:val="single" w:sz="4" w:color="D9D9D9"/>
+              <w:right w:val="single" w:sz="4" w:color="D9D9D9"/>
+            </w:tcBorders>
+            <w:shd w:fill="FFFFFF"/>
+          </w:tcPr>
+          <w:p>
+            <w:pPr>
+              <w:spacing w:after="40" w:before="40" w:line="252" w:lineRule="auto"/>
+            </w:pPr>
+            <w:r>
+              <w:rPr>
+                <w:rFonts w:ascii="Arial" w:hAnsi="Arial"/>
+                <w:b w:val="0"/>
+                <w:color w:val="17213A"/>
+                <w:sz w:val="18"/>
+              </w:rPr>
+              <w:t>Which exact purchase was authorized?</w:t>
+            </w:r>
+          </w:p>
+        </w:tc>
+        <w:tc>
+          <w:tcPr>
+            <w:tcW w:type="dxa" w:w="3686"/>
+            <w:tcMar>
+              <w:top w:w="100" w:type="dxa"/>
+              <w:left w:w="100" w:type="dxa"/>
+              <w:bottom w:w="100" w:type="dxa"/>
+              <w:right w:w="100" w:type="dxa"/>
+            </w:tcMar>
+            <w:tcBorders>
+              <w:top w:val="single" w:sz="4" w:color="D9D9D9"/>
+              <w:left w:val="single" w:sz="4" w:color="D9D9D9"/>
+              <w:bottom w:val="single" w:sz="4" w:color="D9D9D9"/>
+              <w:right w:val="single" w:sz="4" w:color="D9D9D9"/>
+            </w:tcBorders>
+            <w:shd w:fill="FFFFFF"/>
+          </w:tcPr>
+          <w:p>
+            <w:pPr>
+              <w:spacing w:after="40" w:before="40" w:line="252" w:lineRule="auto"/>
+            </w:pPr>
+            <w:r>
+              <w:rPr>
+                <w:rFonts w:ascii="Arial" w:hAnsi="Arial"/>
+                <w:b w:val="0"/>
+                <w:color w:val="17213A"/>
+                <w:sz w:val="18"/>
+              </w:rPr>
+              <w:t>Immutable parent/BIAC binding and derived child intent</w:t>
+            </w:r>
+          </w:p>
+        </w:tc>
+      </w:tr>
+      <w:tr>
+        <w:trPr>
+          <w:cantSplit/>
+        </w:trPr>
+        <w:tc>
+          <w:tcPr>
+            <w:tcW w:type="dxa" w:w="2232"/>
+            <w:tcMar>
+              <w:top w:w="100" w:type="dxa"/>
+              <w:left w:w="100" w:type="dxa"/>
+              <w:bottom w:w="100" w:type="dxa"/>
+              <w:right w:w="100" w:type="dxa"/>
+            </w:tcMar>
+            <w:tcBorders>
+              <w:top w:val="single" w:sz="4" w:color="D9D9D9"/>
+              <w:left w:val="single" w:sz="4" w:color="D9D9D9"/>
+              <w:bottom w:val="single" w:sz="4" w:color="D9D9D9"/>
+              <w:right w:val="single" w:sz="4" w:color="D9D9D9"/>
+            </w:tcBorders>
+            <w:shd w:fill="F3F6FA"/>
+          </w:tcPr>
+          <w:p>
+            <w:pPr>
+              <w:spacing w:after="40" w:before="40" w:line="252" w:lineRule="auto"/>
+            </w:pPr>
+            <w:r>
+              <w:rPr>
+                <w:rFonts w:ascii="Arial" w:hAnsi="Arial"/>
+                <w:b w:val="0"/>
+                <w:color w:val="17213A"/>
+                <w:sz w:val="18"/>
+              </w:rPr>
+              <w:t>Current card, MFA and approval</w:t>
+            </w:r>
+          </w:p>
+        </w:tc>
+        <w:tc>
+          <w:tcPr>
+            <w:tcW w:type="dxa" w:w="3960"/>
+            <w:tcMar>
+              <w:top w:w="100" w:type="dxa"/>
+              <w:left w:w="100" w:type="dxa"/>
+              <w:bottom w:w="100" w:type="dxa"/>
+              <w:right w:w="100" w:type="dxa"/>
+            </w:tcMar>
+            <w:tcBorders>
+              <w:top w:val="single" w:sz="4" w:color="D9D9D9"/>
+              <w:left w:val="single" w:sz="4" w:color="D9D9D9"/>
+              <w:bottom w:val="single" w:sz="4" w:color="D9D9D9"/>
+              <w:right w:val="single" w:sz="4" w:color="D9D9D9"/>
+            </w:tcBorders>
+            <w:shd w:fill="F3F6FA"/>
+          </w:tcPr>
+          <w:p>
+            <w:pPr>
+              <w:spacing w:after="40" w:before="40" w:line="252" w:lineRule="auto"/>
+            </w:pPr>
+            <w:r>
+              <w:rPr>
+                <w:rFonts w:ascii="Arial" w:hAnsi="Arial"/>
+                <w:b w:val="0"/>
+                <w:color w:val="17213A"/>
+                <w:sz w:val="18"/>
+              </w:rPr>
+              <w:t>Did the device authorize these facts?</w:t>
+            </w:r>
+          </w:p>
+        </w:tc>
+        <w:tc>
+          <w:tcPr>
+            <w:tcW w:type="dxa" w:w="3686"/>
+            <w:tcMar>
+              <w:top w:w="100" w:type="dxa"/>
+              <w:left w:w="100" w:type="dxa"/>
+              <w:bottom w:w="100" w:type="dxa"/>
+              <w:right w:w="100" w:type="dxa"/>
+            </w:tcMar>
+            <w:tcBorders>
+              <w:top w:val="single" w:sz="4" w:color="D9D9D9"/>
+              <w:left w:val="single" w:sz="4" w:color="D9D9D9"/>
+              <w:bottom w:val="single" w:sz="4" w:color="D9D9D9"/>
+              <w:right w:val="single" w:sz="4" w:color="D9D9D9"/>
+            </w:tcBorders>
+            <w:shd w:fill="F3F6FA"/>
+          </w:tcPr>
+          <w:p>
+            <w:pPr>
+              <w:spacing w:after="40" w:before="40" w:line="252" w:lineRule="auto"/>
+            </w:pPr>
+            <w:r>
+              <w:rPr>
+                <w:rFonts w:ascii="Arial" w:hAnsi="Arial"/>
+                <w:b w:val="0"/>
+                <w:color w:val="17213A"/>
+                <w:sz w:val="18"/>
+              </w:rPr>
+              <w:t>Action, certificate and card hashes; separate per-leg scope</w:t>
+            </w:r>
+          </w:p>
+        </w:tc>
+      </w:tr>
+      <w:tr>
+        <w:trPr>
+          <w:cantSplit/>
+        </w:trPr>
+        <w:tc>
+          <w:tcPr>
+            <w:tcW w:type="dxa" w:w="2232"/>
+            <w:tcMar>
+              <w:top w:w="100" w:type="dxa"/>
+              <w:left w:w="100" w:type="dxa"/>
+              <w:bottom w:w="100" w:type="dxa"/>
+              <w:right w:w="100" w:type="dxa"/>
+            </w:tcMar>
+            <w:tcBorders>
+              <w:top w:val="single" w:sz="4" w:color="D9D9D9"/>
+              <w:left w:val="single" w:sz="4" w:color="D9D9D9"/>
+              <w:bottom w:val="single" w:sz="4" w:color="D9D9D9"/>
+              <w:right w:val="single" w:sz="4" w:color="D9D9D9"/>
+            </w:tcBorders>
+            <w:shd w:fill="FFFFFF"/>
+          </w:tcPr>
+          <w:p>
+            <w:pPr>
+              <w:spacing w:after="40" w:before="40" w:line="252" w:lineRule="auto"/>
+            </w:pPr>
+            <w:r>
+              <w:rPr>
+                <w:rFonts w:ascii="Arial" w:hAnsi="Arial"/>
+                <w:b w:val="0"/>
+                <w:color w:val="17213A"/>
+                <w:sz w:val="18"/>
+              </w:rPr>
+              <w:t>Signed bank receipt and audit</w:t>
+            </w:r>
+          </w:p>
+        </w:tc>
+        <w:tc>
+          <w:tcPr>
+            <w:tcW w:type="dxa" w:w="3960"/>
+            <w:tcMar>
+              <w:top w:w="100" w:type="dxa"/>
+              <w:left w:w="100" w:type="dxa"/>
+              <w:bottom w:w="100" w:type="dxa"/>
+              <w:right w:w="100" w:type="dxa"/>
+            </w:tcMar>
+            <w:tcBorders>
+              <w:top w:val="single" w:sz="4" w:color="D9D9D9"/>
+              <w:left w:val="single" w:sz="4" w:color="D9D9D9"/>
+              <w:bottom w:val="single" w:sz="4" w:color="D9D9D9"/>
+              <w:right w:val="single" w:sz="4" w:color="D9D9D9"/>
+            </w:tcBorders>
+            <w:shd w:fill="FFFFFF"/>
+          </w:tcPr>
+          <w:p>
+            <w:pPr>
+              <w:spacing w:after="40" w:before="40" w:line="252" w:lineRule="auto"/>
+            </w:pPr>
+            <w:r>
+              <w:rPr>
+                <w:rFonts w:ascii="Arial" w:hAnsi="Arial"/>
+                <w:b w:val="0"/>
+                <w:color w:val="17213A"/>
+                <w:sz w:val="18"/>
+              </w:rPr>
+              <w:t>What actually happened?</w:t>
+            </w:r>
+          </w:p>
+        </w:tc>
+        <w:tc>
+          <w:tcPr>
+            <w:tcW w:type="dxa" w:w="3686"/>
+            <w:tcMar>
+              <w:top w:w="100" w:type="dxa"/>
+              <w:left w:w="100" w:type="dxa"/>
+              <w:bottom w:w="100" w:type="dxa"/>
+              <w:right w:w="100" w:type="dxa"/>
+            </w:tcMar>
+            <w:tcBorders>
+              <w:top w:val="single" w:sz="4" w:color="D9D9D9"/>
+              <w:left w:val="single" w:sz="4" w:color="D9D9D9"/>
+              <w:bottom w:val="single" w:sz="4" w:color="D9D9D9"/>
+              <w:right w:val="single" w:sz="4" w:color="D9D9D9"/>
+            </w:tcBorders>
+            <w:shd w:fill="FFFFFF"/>
+          </w:tcPr>
+          <w:p>
+            <w:pPr>
+              <w:spacing w:after="40" w:before="40" w:line="252" w:lineRule="auto"/>
+            </w:pPr>
+            <w:r>
+              <w:rPr>
+                <w:rFonts w:ascii="Arial" w:hAnsi="Arial"/>
+                <w:b w:val="0"/>
+                <w:color w:val="17213A"/>
+                <w:sz w:val="18"/>
+              </w:rPr>
+              <w:t>Operation identity, exact effect, final state and retained chain head</w:t>
+            </w:r>
+          </w:p>
+        </w:tc>
+      </w:tr>
+    </w:tbl>
+    <w:p>
+      <w:pPr>
+        <w:spacing w:after="40"/>
+      </w:pPr>
     </w:p>
     <w:p>
       <w:r>
-        <w:rPr>
-          <w:b w:val="0"/>
-        </w:rPr>
-        <w:t>The blind corpus retains its isolated-author provenance and original bytes. Earlier development reruns exposed it to adapter corrections, so the final rerun is not an untouched first-pass holdout. M7 pairs malicious inputs with authorized benign twins. A settled but incorrectly narrated benign transfer is a completion failure until fixed and measured again. F4 removes the model-authored expected literal from reference generation: integer 1000 mismatched the authenticated exact value 1000/1. The fact validator remains unchanged.</w:t>
+        <w:t>The parent summary distinguishes completed, partial, cancelled/failed and unknown. A legal settled purchase before Stop remains an actual effect. Unknown outcomes retain reservations and require receipt lookup; they do not justify resending an order. Performance benchmarks are not realized cash gains or losses.</w:t>
       </w:r>
     </w:p>
     <w:p>
       <w:pPr>
         <w:pStyle w:val="Heading2"/>
+        <w:keepNext/>
+        <w:pageBreakBefore/>
       </w:pPr>
       <w:r>
-        <w:t>Artifact custody</w:t>
+        <w:t>Audit checkpoint retention is part of verification</w:t>
+      </w:r>
+    </w:p>
+    <w:p>
+      <w:pPr>
+        <w:keepNext/>
+        <w:spacing w:before="80" w:after="80"/>
+        <w:jc w:val="center"/>
+      </w:pPr>
+      <w:r>
+        <w:drawing>
+          <wp:inline xmlns:a="http://schemas.openxmlformats.org/drawingml/2006/main" xmlns:pic="http://schemas.openxmlformats.org/drawingml/2006/picture">
+            <wp:extent cx="6236208" cy="2158687"/>
+            <wp:docPr id="3" name="Picture 3" descr="Retained I1 scripted audit screen. The audit exposes decisions and commitments; it does not display raw private utterances or real personal information."/>
+            <wp:cNvGraphicFramePr>
+              <a:graphicFrameLocks noChangeAspect="1"/>
+            </wp:cNvGraphicFramePr>
+            <a:graphic>
+              <a:graphicData uri="http://schemas.openxmlformats.org/drawingml/2006/picture">
+                <pic:pic>
+                  <pic:nvPicPr>
+                    <pic:cNvPr id="0" name="11-audit-doc.png"/>
+                    <pic:cNvPicPr/>
+                  </pic:nvPicPr>
+                  <pic:blipFill>
+                    <a:blip r:embed="rId14"/>
+                    <a:stretch>
+                      <a:fillRect/>
+                    </a:stretch>
+                  </pic:blipFill>
+                  <pic:spPr>
+                    <a:xfrm>
+                      <a:off x="0" y="0"/>
+                      <a:ext cx="6236208" cy="2158687"/>
+                    </a:xfrm>
+                    <a:prstGeom prst="rect"/>
+                  </pic:spPr>
+                </pic:pic>
+              </a:graphicData>
+            </a:graphic>
+          </wp:inline>
+        </w:drawing>
+      </w:r>
+    </w:p>
+    <w:p>
+      <w:pPr>
+        <w:pStyle w:val="Caption"/>
+        <w:spacing w:after="200"/>
+      </w:pPr>
+      <w:r>
+        <w:t>Retained I1 scripted audit screen. The audit exposes decisions and commitments; it does not display raw private utterances or real personal information.</w:t>
+      </w:r>
+    </w:p>
+    <w:p>
+      <w:r>
+        <w:t>Audit appends canonical JSON bytes plus newline and checks sequence and previous hash against retained state. Rejections remain part of the trace. Write failure blocks protected execution. A chain can reveal modification relative to a trusted head; it cannot establish integrity if every local log and trusted checkpoint is replaced together.</w:t>
       </w:r>
     </w:p>
     <w:tbl>
       <w:tblPr>
-        <w:tblStyle w:val="TableGrid"/>
         <w:tblW w:type="auto" w:w="0"/>
         <w:jc w:val="center"/>
         <w:tblLayout w:type="fixed"/>
@@ -1225,36 +2606,64 @@
         <w:tc>
           <w:tcPr>
             <w:tcW w:type="dxa" w:w="4939"/>
-            <w:shd w:fill="E8EFF6"/>
+            <w:tcMar>
+              <w:top w:w="100" w:type="dxa"/>
+              <w:left w:w="100" w:type="dxa"/>
+              <w:bottom w:w="100" w:type="dxa"/>
+              <w:right w:w="100" w:type="dxa"/>
+            </w:tcMar>
+            <w:tcBorders>
+              <w:top w:val="single" w:sz="4" w:color="D9D9D9"/>
+              <w:left w:val="single" w:sz="4" w:color="D9D9D9"/>
+              <w:bottom w:val="single" w:sz="4" w:color="D9D9D9"/>
+              <w:right w:val="single" w:sz="4" w:color="D9D9D9"/>
+            </w:tcBorders>
+            <w:shd w:fill="17213A"/>
           </w:tcPr>
           <w:p>
             <w:pPr>
-              <w:spacing w:after="60" w:before="40"/>
+              <w:spacing w:after="40" w:before="40" w:line="252" w:lineRule="auto"/>
             </w:pPr>
             <w:r>
               <w:rPr>
+                <w:rFonts w:ascii="Arial" w:hAnsi="Arial"/>
                 <w:b/>
+                <w:color w:val="FFFFFF"/>
                 <w:sz w:val="18"/>
               </w:rPr>
-              <w:t>Artifact</w:t>
+              <w:t>Supplied artifact</w:t>
             </w:r>
           </w:p>
         </w:tc>
         <w:tc>
           <w:tcPr>
             <w:tcW w:type="dxa" w:w="4939"/>
-            <w:shd w:fill="E8EFF6"/>
+            <w:tcMar>
+              <w:top w:w="100" w:type="dxa"/>
+              <w:left w:w="100" w:type="dxa"/>
+              <w:bottom w:w="100" w:type="dxa"/>
+              <w:right w:w="100" w:type="dxa"/>
+            </w:tcMar>
+            <w:tcBorders>
+              <w:top w:val="single" w:sz="4" w:color="D9D9D9"/>
+              <w:left w:val="single" w:sz="4" w:color="D9D9D9"/>
+              <w:bottom w:val="single" w:sz="4" w:color="D9D9D9"/>
+              <w:right w:val="single" w:sz="4" w:color="D9D9D9"/>
+            </w:tcBorders>
+            <w:shd w:fill="17213A"/>
           </w:tcPr>
           <w:p>
             <w:pPr>
-              <w:spacing w:after="60" w:before="40"/>
+              <w:spacing w:after="40" w:before="40" w:line="252" w:lineRule="auto"/>
             </w:pPr>
             <w:r>
               <w:rPr>
+                <w:rFonts w:ascii="Arial" w:hAnsi="Arial"/>
                 <w:b/>
+                <w:color w:val="FFFFFF"/>
                 <w:sz w:val="18"/>
               </w:rPr>
-              <w:t>Purpose</w:t>
+              <w:t>Purpose and availability</w:t>
             </w:r>
           </w:p>
         </w:tc>
@@ -1266,35 +2675,64 @@
         <w:tc>
           <w:tcPr>
             <w:tcW w:type="dxa" w:w="4939"/>
+            <w:tcMar>
+              <w:top w:w="100" w:type="dxa"/>
+              <w:left w:w="100" w:type="dxa"/>
+              <w:bottom w:w="100" w:type="dxa"/>
+              <w:right w:w="100" w:type="dxa"/>
+            </w:tcMar>
+            <w:tcBorders>
+              <w:top w:val="single" w:sz="4" w:color="D9D9D9"/>
+              <w:left w:val="single" w:sz="4" w:color="D9D9D9"/>
+              <w:bottom w:val="single" w:sz="4" w:color="D9D9D9"/>
+              <w:right w:val="single" w:sz="4" w:color="D9D9D9"/>
+            </w:tcBorders>
+            <w:shd w:fill="FFFFFF"/>
           </w:tcPr>
           <w:p>
             <w:pPr>
-              <w:spacing w:after="60" w:before="40"/>
+              <w:spacing w:after="40" w:before="40" w:line="252" w:lineRule="auto"/>
             </w:pPr>
-            <w:hyperlink r:id="rId10">
-              <w:r>
-                <w:rPr>
-                  <w:color w:val="163B65"/>
-                </w:rPr>
-                <w:t>results/FINAL-RESULTS.md</w:t>
-              </w:r>
-            </w:hyperlink>
+            <w:r>
+              <w:rPr>
+                <w:rFonts w:ascii="Arial" w:hAnsi="Arial"/>
+                <w:b w:val="0"/>
+                <w:color w:val="17213A"/>
+                <w:sz w:val="18"/>
+              </w:rPr>
+              <w:t>FINAL-RESULTS and original evidence</w:t>
+            </w:r>
           </w:p>
         </w:tc>
         <w:tc>
           <w:tcPr>
             <w:tcW w:type="dxa" w:w="4939"/>
+            <w:tcMar>
+              <w:top w:w="100" w:type="dxa"/>
+              <w:left w:w="100" w:type="dxa"/>
+              <w:bottom w:w="100" w:type="dxa"/>
+              <w:right w:w="100" w:type="dxa"/>
+            </w:tcMar>
+            <w:tcBorders>
+              <w:top w:val="single" w:sz="4" w:color="D9D9D9"/>
+              <w:left w:val="single" w:sz="4" w:color="D9D9D9"/>
+              <w:bottom w:val="single" w:sz="4" w:color="D9D9D9"/>
+              <w:right w:val="single" w:sz="4" w:color="D9D9D9"/>
+            </w:tcBorders>
+            <w:shd w:fill="FFFFFF"/>
           </w:tcPr>
           <w:p>
             <w:pPr>
-              <w:spacing w:after="60" w:before="40"/>
+              <w:spacing w:after="40" w:before="40" w:line="252" w:lineRule="auto"/>
             </w:pPr>
             <w:r>
               <w:rPr>
+                <w:rFonts w:ascii="Arial" w:hAnsi="Arial"/>
                 <w:b w:val="0"/>
+                <w:color w:val="17213A"/>
                 <w:sz w:val="18"/>
               </w:rPr>
-              <w:t>English release measurements, coverage, failures and confidence interpretation</w:t>
+              <w:t>F5 measurements linked to original raw outputs and manifest hashes</w:t>
             </w:r>
           </w:p>
         </w:tc>
@@ -1306,35 +2744,64 @@
         <w:tc>
           <w:tcPr>
             <w:tcW w:type="dxa" w:w="4939"/>
+            <w:tcMar>
+              <w:top w:w="100" w:type="dxa"/>
+              <w:left w:w="100" w:type="dxa"/>
+              <w:bottom w:w="100" w:type="dxa"/>
+              <w:right w:w="100" w:type="dxa"/>
+            </w:tcMar>
+            <w:tcBorders>
+              <w:top w:val="single" w:sz="4" w:color="D9D9D9"/>
+              <w:left w:val="single" w:sz="4" w:color="D9D9D9"/>
+              <w:bottom w:val="single" w:sz="4" w:color="D9D9D9"/>
+              <w:right w:val="single" w:sz="4" w:color="D9D9D9"/>
+            </w:tcBorders>
+            <w:shd w:fill="F3F6FA"/>
           </w:tcPr>
           <w:p>
             <w:pPr>
-              <w:spacing w:after="60" w:before="40"/>
+              <w:spacing w:after="40" w:before="40" w:line="252" w:lineRule="auto"/>
             </w:pPr>
-            <w:hyperlink r:id="rId23">
-              <w:r>
-                <w:rPr>
-                  <w:color w:val="163B65"/>
-                </w:rPr>
-                <w:t>evidence/final-f5/</w:t>
-              </w:r>
-            </w:hyperlink>
+            <w:r>
+              <w:rPr>
+                <w:rFonts w:ascii="Arial" w:hAnsi="Arial"/>
+                <w:b w:val="0"/>
+                <w:color w:val="17213A"/>
+                <w:sz w:val="18"/>
+              </w:rPr>
+              <w:t>Retained I1 screenshots and capture manifest</w:t>
+            </w:r>
           </w:p>
         </w:tc>
         <w:tc>
           <w:tcPr>
             <w:tcW w:type="dxa" w:w="4939"/>
+            <w:tcMar>
+              <w:top w:w="100" w:type="dxa"/>
+              <w:left w:w="100" w:type="dxa"/>
+              <w:bottom w:w="100" w:type="dxa"/>
+              <w:right w:w="100" w:type="dxa"/>
+            </w:tcMar>
+            <w:tcBorders>
+              <w:top w:val="single" w:sz="4" w:color="D9D9D9"/>
+              <w:left w:val="single" w:sz="4" w:color="D9D9D9"/>
+              <w:bottom w:val="single" w:sz="4" w:color="D9D9D9"/>
+              <w:right w:val="single" w:sz="4" w:color="D9D9D9"/>
+            </w:tcBorders>
+            <w:shd w:fill="F3F6FA"/>
           </w:tcPr>
           <w:p>
             <w:pPr>
-              <w:spacing w:after="60" w:before="40"/>
+              <w:spacing w:after="40" w:before="40" w:line="252" w:lineRule="auto"/>
             </w:pPr>
             <w:r>
               <w:rPr>
+                <w:rFonts w:ascii="Arial" w:hAnsi="Arial"/>
                 <w:b w:val="0"/>
+                <w:color w:val="17213A"/>
                 <w:sz w:val="18"/>
               </w:rPr>
-              <w:t>Local raw final-run logs, live responses, replay and execution bundles; excluded from Git</w:t>
+              <w:t>I1 scripted interaction states, captions and hashes</w:t>
             </w:r>
           </w:p>
         </w:tc>
@@ -1346,35 +2813,64 @@
         <w:tc>
           <w:tcPr>
             <w:tcW w:type="dxa" w:w="4939"/>
+            <w:tcMar>
+              <w:top w:w="100" w:type="dxa"/>
+              <w:left w:w="100" w:type="dxa"/>
+              <w:bottom w:w="100" w:type="dxa"/>
+              <w:right w:w="100" w:type="dxa"/>
+            </w:tcMar>
+            <w:tcBorders>
+              <w:top w:val="single" w:sz="4" w:color="D9D9D9"/>
+              <w:left w:val="single" w:sz="4" w:color="D9D9D9"/>
+              <w:bottom w:val="single" w:sz="4" w:color="D9D9D9"/>
+              <w:right w:val="single" w:sz="4" w:color="D9D9D9"/>
+            </w:tcBorders>
+            <w:shd w:fill="FFFFFF"/>
           </w:tcPr>
           <w:p>
             <w:pPr>
-              <w:spacing w:after="60" w:before="40"/>
+              <w:spacing w:after="40" w:before="40" w:line="252" w:lineRule="auto"/>
             </w:pPr>
-            <w:hyperlink r:id="rId24">
-              <w:r>
-                <w:rPr>
-                  <w:color w:val="163B65"/>
-                </w:rPr>
-                <w:t>evidence/final-summary/</w:t>
-              </w:r>
-            </w:hyperlink>
+            <w:r>
+              <w:rPr>
+                <w:rFonts w:ascii="Arial" w:hAnsi="Arial"/>
+                <w:b w:val="0"/>
+                <w:color w:val="17213A"/>
+                <w:sz w:val="18"/>
+              </w:rPr>
+              <w:t>Rule matrix and regulatory mapping</w:t>
+            </w:r>
           </w:p>
         </w:tc>
         <w:tc>
           <w:tcPr>
             <w:tcW w:type="dxa" w:w="4939"/>
+            <w:tcMar>
+              <w:top w:w="100" w:type="dxa"/>
+              <w:left w:w="100" w:type="dxa"/>
+              <w:bottom w:w="100" w:type="dxa"/>
+              <w:right w:w="100" w:type="dxa"/>
+            </w:tcMar>
+            <w:tcBorders>
+              <w:top w:val="single" w:sz="4" w:color="D9D9D9"/>
+              <w:left w:val="single" w:sz="4" w:color="D9D9D9"/>
+              <w:bottom w:val="single" w:sz="4" w:color="D9D9D9"/>
+              <w:right w:val="single" w:sz="4" w:color="D9D9D9"/>
+            </w:tcBorders>
+            <w:shd w:fill="FFFFFF"/>
           </w:tcPr>
           <w:p>
             <w:pPr>
-              <w:spacing w:after="60" w:before="40"/>
+              <w:spacing w:after="40" w:before="40" w:line="252" w:lineRule="auto"/>
             </w:pPr>
             <w:r>
               <w:rPr>
+                <w:rFonts w:ascii="Arial" w:hAnsi="Arial"/>
                 <w:b w:val="0"/>
+                <w:color w:val="17213A"/>
                 <w:sz w:val="18"/>
               </w:rPr>
-              <w:t>Compact release inventory and selected verified summaries/screenshots suitable for source control</w:t>
+              <w:t>Source-level controls, tests, official-source scope and gaps</w:t>
             </w:r>
           </w:p>
         </w:tc>
@@ -1386,35 +2882,64 @@
         <w:tc>
           <w:tcPr>
             <w:tcW w:type="dxa" w:w="4939"/>
+            <w:tcMar>
+              <w:top w:w="100" w:type="dxa"/>
+              <w:left w:w="100" w:type="dxa"/>
+              <w:bottom w:w="100" w:type="dxa"/>
+              <w:right w:w="100" w:type="dxa"/>
+            </w:tcMar>
+            <w:tcBorders>
+              <w:top w:val="single" w:sz="4" w:color="D9D9D9"/>
+              <w:left w:val="single" w:sz="4" w:color="D9D9D9"/>
+              <w:bottom w:val="single" w:sz="4" w:color="D9D9D9"/>
+              <w:right w:val="single" w:sz="4" w:color="D9D9D9"/>
+            </w:tcBorders>
+            <w:shd w:fill="F3F6FA"/>
           </w:tcPr>
           <w:p>
             <w:pPr>
-              <w:spacing w:after="60" w:before="40"/>
+              <w:spacing w:after="40" w:before="40" w:line="252" w:lineRule="auto"/>
             </w:pPr>
-            <w:hyperlink r:id="rId25">
-              <w:r>
-                <w:rPr>
-                  <w:color w:val="163B65"/>
-                </w:rPr>
-                <w:t>F5 record</w:t>
-              </w:r>
-            </w:hyperlink>
+            <w:r>
+              <w:rPr>
+                <w:rFonts w:ascii="Arial" w:hAnsi="Arial"/>
+                <w:b w:val="0"/>
+                <w:color w:val="17213A"/>
+                <w:sz w:val="18"/>
+              </w:rPr>
+              <w:t>Source code and regression tests</w:t>
+            </w:r>
           </w:p>
         </w:tc>
         <w:tc>
           <w:tcPr>
             <w:tcW w:type="dxa" w:w="4939"/>
+            <w:tcMar>
+              <w:top w:w="100" w:type="dxa"/>
+              <w:left w:w="100" w:type="dxa"/>
+              <w:bottom w:w="100" w:type="dxa"/>
+              <w:right w:w="100" w:type="dxa"/>
+            </w:tcMar>
+            <w:tcBorders>
+              <w:top w:val="single" w:sz="4" w:color="D9D9D9"/>
+              <w:left w:val="single" w:sz="4" w:color="D9D9D9"/>
+              <w:bottom w:val="single" w:sz="4" w:color="D9D9D9"/>
+              <w:right w:val="single" w:sz="4" w:color="D9D9D9"/>
+            </w:tcBorders>
+            <w:shd w:fill="F3F6FA"/>
           </w:tcPr>
           <w:p>
             <w:pPr>
-              <w:spacing w:after="60" w:before="40"/>
+              <w:spacing w:after="40" w:before="40" w:line="252" w:lineRule="auto"/>
             </w:pPr>
             <w:r>
               <w:rPr>
+                <w:rFonts w:ascii="Arial" w:hAnsi="Arial"/>
                 <w:b w:val="0"/>
+                <w:color w:val="17213A"/>
                 <w:sz w:val="18"/>
               </w:rPr>
-              <w:t>Fourth-round repairs, completed F4 work, exact final commands, validation and remaining limits</w:t>
+              <w:t>Rerunnable deterministic mechanisms and review reproducers</w:t>
             </w:r>
           </w:p>
         </w:tc>
@@ -1426,75 +2951,64 @@
         <w:tc>
           <w:tcPr>
             <w:tcW w:type="dxa" w:w="4939"/>
+            <w:tcMar>
+              <w:top w:w="100" w:type="dxa"/>
+              <w:left w:w="100" w:type="dxa"/>
+              <w:bottom w:w="100" w:type="dxa"/>
+              <w:right w:w="100" w:type="dxa"/>
+            </w:tcMar>
+            <w:tcBorders>
+              <w:top w:val="single" w:sz="4" w:color="D9D9D9"/>
+              <w:left w:val="single" w:sz="4" w:color="D9D9D9"/>
+              <w:bottom w:val="single" w:sz="4" w:color="D9D9D9"/>
+              <w:right w:val="single" w:sz="4" w:color="D9D9D9"/>
+            </w:tcBorders>
+            <w:shd w:fill="FFFFFF"/>
           </w:tcPr>
           <w:p>
             <w:pPr>
-              <w:spacing w:after="60" w:before="40"/>
+              <w:spacing w:after="40" w:before="40" w:line="252" w:lineRule="auto"/>
             </w:pPr>
-            <w:hyperlink r:id="rId26">
-              <w:r>
-                <w:rPr>
-                  <w:color w:val="163B65"/>
-                </w:rPr>
-                <w:t>artifact-manifest.json</w:t>
-              </w:r>
-            </w:hyperlink>
+            <w:r>
+              <w:rPr>
+                <w:rFonts w:ascii="Arial" w:hAnsi="Arial"/>
+                <w:b w:val="0"/>
+                <w:color w:val="17213A"/>
+                <w:sz w:val="18"/>
+              </w:rPr>
+              <w:t>Original final-run raw recordings</w:t>
+            </w:r>
           </w:p>
         </w:tc>
         <w:tc>
           <w:tcPr>
             <w:tcW w:type="dxa" w:w="4939"/>
+            <w:tcMar>
+              <w:top w:w="100" w:type="dxa"/>
+              <w:left w:w="100" w:type="dxa"/>
+              <w:bottom w:w="100" w:type="dxa"/>
+              <w:right w:w="100" w:type="dxa"/>
+            </w:tcMar>
+            <w:tcBorders>
+              <w:top w:val="single" w:sz="4" w:color="D9D9D9"/>
+              <w:left w:val="single" w:sz="4" w:color="D9D9D9"/>
+              <w:bottom w:val="single" w:sz="4" w:color="D9D9D9"/>
+              <w:right w:val="single" w:sz="4" w:color="D9D9D9"/>
+            </w:tcBorders>
+            <w:shd w:fill="FFFFFF"/>
           </w:tcPr>
           <w:p>
             <w:pPr>
-              <w:spacing w:after="60" w:before="40"/>
+              <w:spacing w:after="40" w:before="40" w:line="252" w:lineRule="auto"/>
             </w:pPr>
             <w:r>
               <w:rPr>
+                <w:rFonts w:ascii="Arial" w:hAnsi="Arial"/>
                 <w:b w:val="0"/>
+                <w:color w:val="17213A"/>
                 <w:sz w:val="18"/>
               </w:rPr>
-              <w:t>Hashes of generated documents, deck and their sources</w:t>
-            </w:r>
-          </w:p>
-        </w:tc>
-      </w:tr>
-      <w:tr>
-        <w:trPr>
-          <w:cantSplit/>
-        </w:trPr>
-        <w:tc>
-          <w:tcPr>
-            <w:tcW w:type="dxa" w:w="4939"/>
-          </w:tcPr>
-          <w:p>
-            <w:pPr>
-              <w:spacing w:after="60" w:before="40"/>
-            </w:pPr>
-            <w:hyperlink r:id="rId27">
-              <w:r>
-                <w:rPr>
-                  <w:color w:val="163B65"/>
-                </w:rPr>
-                <w:t>rule-matrix.md</w:t>
-              </w:r>
-            </w:hyperlink>
-          </w:p>
-        </w:tc>
-        <w:tc>
-          <w:tcPr>
-            <w:tcW w:type="dxa" w:w="4939"/>
-          </w:tcPr>
-          <w:p>
-            <w:pPr>
-              <w:spacing w:after="60" w:before="40"/>
-            </w:pPr>
-            <w:r>
-              <w:rPr>
-                <w:b w:val="0"/>
-                <w:sz w:val="18"/>
-              </w:rPr>
-              <w:t>Current registered rules, execution sites, tests and TCB inventory</w:t>
+              <w:t>Complete evidence/final-f5 bundle retained; P2 verification used code before I1</w:t>
             </w:r>
           </w:p>
         </w:tc>
@@ -1507,180 +3021,40 @@
     </w:p>
     <w:p>
       <w:r>
-        <w:rPr>
-          <w:b w:val="0"/>
-        </w:rPr>
-        <w:t>The evidence CLI packages local artifacts with a file manifest. It does not create a genuine live run from a scripted result or certify the independence of an author. Hashes bind bytes against the retained inventory; they are not external notarization.</w:t>
+        <w:t xml:space="preserve">The </w:t>
+      </w:r>
+      <w:hyperlink r:id="rId15">
+        <w:r>
+          <w:rPr>
+            <w:color w:val="315FD8"/>
+          </w:rPr>
+          <w:t>artifact manifest</w:t>
+        </w:r>
+      </w:hyperlink>
+      <w:r>
+        <w:t xml:space="preserve"> binds generated deliverables to their source bytes. Hashes are integrity aids against the retained inventory, not external notarization. The original archived evidence described by F5 is not represented as a newly produced archive here.</w:t>
       </w:r>
     </w:p>
     <w:p>
       <w:r>
-        <w:rPr>
-          <w:b w:val="0"/>
-        </w:rPr>
-        <w:t xml:space="preserve">The final local archive is </w:t>
+        <w:t xml:space="preserve">Selected historical UI evidence remains historical scripted material. The retained I1 captures have their own manifest in </w:t>
       </w:r>
-      <w:r>
-        <w:rPr>
-          <w:rFonts w:ascii="Consolas" w:hAnsi="Consolas"/>
-          <w:b w:val="0"/>
-          <w:sz w:val="16"/>
-        </w:rPr>
-        <w:t>dist/​corridor-evidence-f5.zip</w:t>
-      </w:r>
-      <w:r>
-        <w:rPr>
-          <w:b w:val="0"/>
-        </w:rPr>
-        <w:t xml:space="preserve">. Its exact byte size, SHA-256, inventory checksum, file count and zero-finding credential-pattern scan are recorded in </w:t>
-      </w:r>
-      <w:hyperlink r:id="rId28">
+      <w:hyperlink r:id="rId16">
         <w:r>
           <w:rPr>
-            <w:color w:val="163B65"/>
+            <w:color w:val="315FD8"/>
           </w:rPr>
-          <w:t>evidence-package.json</w:t>
+          <w:t>screenshots</w:t>
         </w:r>
       </w:hyperlink>
       <w:r>
-        <w:rPr>
-          <w:b w:val="0"/>
-        </w:rPr>
-        <w:t>. The archive includes historical attempts as well as the final measured runs, with their original paths and modes preserved. The raw archive and complete inventory stay outside Git; the compact index is committed with the submission sources.</w:t>
-      </w:r>
-    </w:p>
-    <w:p>
-      <w:r>
-        <w:rPr>
-          <w:b w:val="0"/>
-        </w:rPr>
-        <w:t xml:space="preserve">Selected UI screenshots from F3 remain labelled historical </w:t>
-      </w:r>
-      <w:r>
-        <w:rPr>
-          <w:b/>
-        </w:rPr>
-        <w:t>scripted</w:t>
-      </w:r>
-      <w:r>
-        <w:rPr>
-          <w:b w:val="0"/>
-        </w:rPr>
-        <w:t xml:space="preserve"> UI evidence, with their original run/source metadata. They do not depict a new final live-model UI run.</w:t>
+        <w:t>. Neither set demonstrates a new live-model UI run, a filmed final video, a timed rehearsal, a public release URL or a competition submission receipt.</w:t>
       </w:r>
     </w:p>
     <w:p>
       <w:pPr>
         <w:pStyle w:val="Heading1"/>
-        <w:pageBreakBefore/>
-      </w:pPr>
-      <w:r>
-        <w:t>02 Logs or Transactions</w:t>
-      </w:r>
-    </w:p>
-    <w:p>
-      <w:pPr>
-        <w:pStyle w:val="Heading2"/>
-      </w:pPr>
-      <w:r>
-        <w:t>What a wealth trace contains</w:t>
-      </w:r>
-    </w:p>
-    <w:p>
-      <w:r>
-        <w:rPr>
-          <w:b w:val="0"/>
-        </w:rPr>
-        <w:t>A trace connects the device-signed request, current policy/catalogue/risk hashes, complete BIAC, immutable parent plan and child intents to exact action/certificate/card hashes. Each red purchase has its own scoped MFA grant and approval token. Signed bank receipts and final holdings/balance establish the actual effect. The parent summary distinguishes completed, partial, cancelled/failed and unknown.</w:t>
-      </w:r>
-    </w:p>
-    <w:p>
-      <w:r>
-        <w:rPr>
-          <w:b w:val="0"/>
-        </w:rPr>
-        <w:t>Canonical financial fields originate in trusted state or signed receipts. Every displayed benchmark is labelled performance benchmark (not guaranteed). Analysis and fact references preserve their origin; raw assistant prose does not become verified execution evidence.</w:t>
-      </w:r>
-    </w:p>
-    <w:p>
-      <w:r>
-        <w:rPr>
-          <w:b w:val="0"/>
-        </w:rPr>
-        <w:t>Audit records append canonical JSON bytes and a newline. Retained heads/checkpoints support chain verification, including rejected decisions. Unknown outcomes retain reservations and require receipt lookup; no second order is sent to manufacture certainty. Partial prior effects remain in the denominator/accounting.</w:t>
-      </w:r>
-    </w:p>
-    <w:p>
-      <w:pPr>
-        <w:pStyle w:val="Heading2"/>
-      </w:pPr>
-      <w:r>
-        <w:t>Security evidence</w:t>
-      </w:r>
-    </w:p>
-    <w:p>
-      <w:r>
-        <w:rPr>
-          <w:b w:val="0"/>
-        </w:rPr>
-        <w:t>The generated rule matrix contains the six allocation checks, approval budget, retake limit and upgrade-review rules. Full execution coverage is reported separately from static marker presence. F1/F2 reproducers, third-round F3 fixes, English J01 matching and the M7 generated-fact correction remain regression evidence. Fourth-round review confirmed ten findings (one high severity), now repaired; all four rejected findings retain specification-aligned regressions. The matrix reports accepted forged proposals and separates baseline MFA protocol gaps from business harm.</w:t>
-      </w:r>
-    </w:p>
-    <w:p>
-      <w:r>
-        <w:rPr>
-          <w:b w:val="0"/>
-        </w:rPr>
-        <w:t xml:space="preserve">Zero prohibited effects are written as </w:t>
-      </w:r>
-      <w:r>
-        <w:rPr>
-          <w:rFonts w:ascii="Consolas" w:hAnsi="Consolas"/>
-          <w:b w:val="0"/>
-          <w:sz w:val="16"/>
-        </w:rPr>
-        <w:t>0/​n (95% upper approximately 3/​n)</w:t>
-      </w:r>
-      <w:r>
-        <w:rPr>
-          <w:b w:val="0"/>
-        </w:rPr>
-        <w:t>, capped at one. The rule-of-three interpretation is descriptive for related attack cases. A nonzero result remains visible, with affected case IDs and exact paths. Benign failures, constructor failures, legal preceding effects and projection differences are not hidden inside a safety score.</w:t>
-      </w:r>
-    </w:p>
-    <w:p>
-      <w:pPr>
-        <w:pStyle w:val="Heading2"/>
-      </w:pPr>
-      <w:r>
-        <w:t>Exclusions and unavailable artifacts</w:t>
-      </w:r>
-    </w:p>
-    <w:p>
-      <w:r>
-        <w:rPr>
-          <w:b w:val="0"/>
-        </w:rPr>
-        <w:t xml:space="preserve">Final-run raw replay, large archives and full generated run trees are not committed. Previously tracked regression fixtures remain separate. The final recordings' absence in a clean clone is intentional and does not imply that strict replay can work without the matching cache. The README gives regeneration instructions. No recorded final video, timed rehearsal, publicly accessible release URL or competition submission receipt was produced: each remains </w:t>
-      </w:r>
-      <w:r>
-        <w:rPr>
-          <w:rFonts w:ascii="Consolas" w:hAnsi="Consolas"/>
-          <w:b w:val="0"/>
-          <w:sz w:val="16"/>
-        </w:rPr>
-        <w:t>not_​run</w:t>
-      </w:r>
-      <w:r>
-        <w:rPr>
-          <w:b w:val="0"/>
-        </w:rPr>
-        <w:t xml:space="preserve"> or unavailable as appropriate.</w:t>
-      </w:r>
-    </w:p>
-    <w:p>
-      <w:pPr>
-        <w:pStyle w:val="Heading1"/>
+        <w:keepNext/>
         <w:pageBreakBefore/>
       </w:pPr>
       <w:r>
@@ -1688,283 +3062,465 @@
       </w:r>
     </w:p>
     <w:p>
+      <w:pPr>
+        <w:pStyle w:val="Heading2"/>
+        <w:keepNext/>
+        <w:pageBreakBefore w:val="0"/>
+      </w:pPr>
       <w:r>
-        <w:rPr>
-          <w:b w:val="0"/>
-        </w:rPr>
-        <w:t>Use Python 3.11 and uv. Install frozen dependencies once with network access or provide a populated package cache. Offline application execution is distinct from first-time dependency installation.</w:t>
+        <w:t>Start with the key free mechanism path</w:t>
+      </w:r>
+    </w:p>
+    <w:p>
+      <w:r>
+        <w:t>The application uses Python 3.11 and the frozen uv lockfile. Install dependencies with network access once or use a populated cache. This installation requirement is distinct from offline application behavior. The following commands exercise deterministic mechanisms without a model key.</w:t>
       </w:r>
     </w:p>
     <w:p>
       <w:pPr>
-        <w:spacing w:after="20"/>
+        <w:spacing w:after="60"/>
       </w:pPr>
       <w:r>
         <w:rPr>
           <w:rFonts w:ascii="Consolas" w:hAnsi="Consolas"/>
-          <w:b w:val="0"/>
-          <w:sz w:val="16"/>
+          <w:sz w:val="17"/>
         </w:rPr>
         <w:t>uv sync --frozen --python 3.11</w:t>
       </w:r>
     </w:p>
     <w:p>
       <w:pPr>
-        <w:spacing w:after="20"/>
+        <w:spacing w:after="60"/>
       </w:pPr>
       <w:r>
         <w:rPr>
           <w:rFonts w:ascii="Consolas" w:hAnsi="Consolas"/>
-          <w:b w:val="0"/>
-          <w:sz w:val="16"/>
+          <w:sz w:val="17"/>
         </w:rPr>
         <w:t>uv run --frozen corridor setup</w:t>
       </w:r>
     </w:p>
     <w:p>
       <w:pPr>
-        <w:spacing w:after="20"/>
+        <w:spacing w:after="60"/>
       </w:pPr>
       <w:r>
         <w:rPr>
           <w:rFonts w:ascii="Consolas" w:hAnsi="Consolas"/>
-          <w:b w:val="0"/>
-          <w:sz w:val="16"/>
-        </w:rPr>
-        <w:t>uv run --frozen corridor test</w:t>
-      </w:r>
-    </w:p>
-    <w:p>
-      <w:pPr>
-        <w:spacing w:after="20"/>
-      </w:pPr>
-      <w:r>
-        <w:rPr>
-          <w:rFonts w:ascii="Consolas" w:hAnsi="Consolas"/>
-          <w:b w:val="0"/>
-          <w:sz w:val="16"/>
+          <w:sz w:val="17"/>
         </w:rPr>
         <w:t>uv run --frozen corridor test --rules-coverage</w:t>
       </w:r>
     </w:p>
     <w:p>
       <w:pPr>
-        <w:spacing w:after="20"/>
+        <w:spacing w:after="60"/>
       </w:pPr>
       <w:r>
         <w:rPr>
           <w:rFonts w:ascii="Consolas" w:hAnsi="Consolas"/>
-          <w:b w:val="0"/>
-          <w:sz w:val="16"/>
+          <w:sz w:val="17"/>
         </w:rPr>
         <w:t>uv run --frozen ruff check .</w:t>
       </w:r>
     </w:p>
     <w:p>
       <w:pPr>
-        <w:spacing w:after="20"/>
+        <w:spacing w:after="60"/>
       </w:pPr>
       <w:r>
         <w:rPr>
           <w:rFonts w:ascii="Consolas" w:hAnsi="Consolas"/>
-          <w:b w:val="0"/>
-          <w:sz w:val="16"/>
+          <w:sz w:val="17"/>
         </w:rPr>
         <w:t>uv run --frozen ruff format --check .</w:t>
       </w:r>
     </w:p>
     <w:p>
       <w:pPr>
-        <w:spacing w:after="20"/>
+        <w:spacing w:after="60"/>
       </w:pPr>
       <w:r>
         <w:rPr>
           <w:rFonts w:ascii="Consolas" w:hAnsi="Consolas"/>
-          <w:b w:val="0"/>
-          <w:sz w:val="16"/>
+          <w:sz w:val="17"/>
         </w:rPr>
         <w:t>uv run --frozen mypy</w:t>
       </w:r>
     </w:p>
     <w:p>
       <w:pPr>
-        <w:spacing w:after="20"/>
+        <w:spacing w:after="60"/>
       </w:pPr>
       <w:r>
         <w:rPr>
           <w:rFonts w:ascii="Consolas" w:hAnsi="Consolas"/>
-          <w:b w:val="0"/>
-          <w:sz w:val="16"/>
+          <w:sz w:val="17"/>
         </w:rPr>
         <w:t>uv run --frozen lint-imports</w:t>
       </w:r>
     </w:p>
     <w:p>
       <w:pPr>
-        <w:spacing w:after="20"/>
+        <w:spacing w:after="60"/>
       </w:pPr>
       <w:r>
         <w:rPr>
           <w:rFonts w:ascii="Consolas" w:hAnsi="Consolas"/>
-          <w:b w:val="0"/>
-          <w:sz w:val="16"/>
+          <w:sz w:val="17"/>
         </w:rPr>
         <w:t>uv run --frozen corridor judge --planner scripted --suite all</w:t>
       </w:r>
     </w:p>
     <w:p>
       <w:pPr>
-        <w:spacing w:after="20"/>
+        <w:spacing w:after="60"/>
       </w:pPr>
       <w:r>
         <w:rPr>
           <w:rFonts w:ascii="Consolas" w:hAnsi="Consolas"/>
-          <w:b w:val="0"/>
-          <w:sz w:val="16"/>
+          <w:sz w:val="17"/>
         </w:rPr>
         <w:t>uv run --frozen corridor judge --planner scripted --suite wealth</w:t>
       </w:r>
     </w:p>
     <w:p>
       <w:pPr>
-        <w:spacing w:after="20"/>
+        <w:spacing w:after="60"/>
       </w:pPr>
       <w:r>
         <w:rPr>
           <w:rFonts w:ascii="Consolas" w:hAnsi="Consolas"/>
-          <w:b w:val="0"/>
-          <w:sz w:val="16"/>
+          <w:sz w:val="17"/>
         </w:rPr>
         <w:t>uv run --frozen corridor adversary</w:t>
       </w:r>
     </w:p>
     <w:p>
       <w:pPr>
-        <w:spacing w:after="20"/>
+        <w:spacing w:after="60"/>
       </w:pPr>
       <w:r>
         <w:rPr>
           <w:rFonts w:ascii="Consolas" w:hAnsi="Consolas"/>
-          <w:b w:val="0"/>
-          <w:sz w:val="16"/>
+          <w:sz w:val="17"/>
         </w:rPr>
         <w:t>uv run --frozen corridor bench --suite wealth</w:t>
       </w:r>
     </w:p>
     <w:p>
+      <w:r>
+        <w:t>The wealth matrix keeps configuration and user policy explicit. Compare prohibited outcomes against their full execution-projection denominator, and benign completion against its separate denominator. Do not combine the scripted matrix with live advisory task counts. A protected refusal is not automatically a successful benign task.</w:t>
+      </w:r>
+    </w:p>
+    <w:p>
       <w:pPr>
-        <w:spacing w:after="20"/>
+        <w:pStyle w:val="Heading2"/>
+        <w:keepNext/>
+        <w:pageBreakBefore w:val="0"/>
+      </w:pPr>
+      <w:r>
+        <w:t>Strict offline replay of the original recorded bundle</w:t>
+      </w:r>
+    </w:p>
+    <w:p>
+      <w:r>
+        <w:t>Run the command below against the original F5 evidence and repository frozen corpus. Preserve the source manifest and model/API profile. The output directory must be new; use a different output path when repeating this run.</w:t>
+      </w:r>
+    </w:p>
+    <w:p>
+      <w:pPr>
+        <w:spacing w:after="60"/>
       </w:pPr>
       <w:r>
         <w:rPr>
           <w:rFonts w:ascii="Consolas" w:hAnsi="Consolas"/>
-          <w:b w:val="0"/>
-          <w:sz w:val="16"/>
+          <w:sz w:val="17"/>
         </w:rPr>
-        <w:t>uv run --frozen corridor evidence</w:t>
+        <w:t>uv run --offline --frozen python scripts/replay_final.py --source evidence/final-f5 --output evidence/reproduced --cases data/blind</w:t>
       </w:r>
     </w:p>
     <w:p>
       <w:r>
-        <w:rPr>
-          <w:b w:val="0"/>
-        </w:rPr>
-        <w:t xml:space="preserve">The final evaluation driver and exact commands are recorded in </w:t>
+        <w:t xml:space="preserve">The </w:t>
       </w:r>
-      <w:hyperlink r:id="rId10">
+      <w:hyperlink r:id="rId17">
         <w:r>
           <w:rPr>
-            <w:color w:val="163B65"/>
+            <w:color w:val="315FD8"/>
           </w:rPr>
-          <w:t>FINAL-RESULTS</w:t>
+          <w:t>current replay summary</w:t>
         </w:r>
       </w:hyperlink>
       <w:r>
+        <w:t xml:space="preserve"> records the I1 verification retained for the current code. Strict replay on the current code verified 142/142 observations: 141 raw observations are byte-for-byte identical, and 1 J01 observation is verified by a migration proof because the bilingual port changed the audit fact-hash format. Network transport was disabled and no API calls occurred. The </w:t>
+      </w:r>
+      <w:hyperlink r:id="rId18">
+        <w:r>
+          <w:rPr>
+            <w:color w:val="315FD8"/>
+          </w:rPr>
+          <w:t>P2 replay summary</w:t>
+        </w:r>
+      </w:hyperlink>
+      <w:r>
+        <w:t xml:space="preserve"> records historical </w:t>
+      </w:r>
+      <w:r>
         <w:rPr>
-          <w:b w:val="0"/>
+          <w:b/>
         </w:rPr>
-        <w:t>. To regenerate raw live data, configure credentials privately and run its recording stages under the shared budget journal. Never print or commit the local environment configuration. Keep failed attempts and their budget reservations. Freeze model, API, reasoning effort, output limit, inputs and source for comparison.</w:t>
+        <w:t>142/142</w:t>
+      </w:r>
+      <w:r>
+        <w:t xml:space="preserve"> byte-for-byte equality on code before I1. It covers main, contrast, dialogue, blind and redteam stages. The driver exited successfully. Equality reproduces the recorded gpt-5.4-mini W04 failure as well as successful observations; it does not turn failed tasks into completed tasks or supply another independent sample.</w:t>
       </w:r>
     </w:p>
     <w:p>
       <w:r>
+        <w:t>A cache miss or mismatched profile must fail without network transport or fallback. The original measurements and the P2 replay output remain separate, so reviewers can inspect both the source records and the reproduced observations.</w:t>
+      </w:r>
+    </w:p>
+    <w:p>
+      <w:r>
+        <w:t xml:space="preserve">The current driver reports raw equality separately from verified reproduction. ADR-014 permits only the named J01 fact-hash migration, requiring both valid audit chains, authenticated facts reproducing both formats, and unchanged remaining observations. A migrated result remains </w:t>
+      </w:r>
+      <w:r>
         <w:rPr>
-          <w:b w:val="0"/>
+          <w:rFonts w:ascii="Consolas" w:hAnsi="Consolas"/>
+          <w:sz w:val="18"/>
         </w:rPr>
-        <w:t>The dedicated offline rerun uses the exact saved model/API profile and a fresh output directory:</w:t>
+        <w:t>identical=false</w:t>
+      </w:r>
+      <w:r>
+        <w:t>. Missing proof or additional differences fail; frozen evidence is never rewritten.</w:t>
       </w:r>
     </w:p>
     <w:p>
       <w:pPr>
-        <w:spacing w:after="20"/>
+        <w:pStyle w:val="Heading2"/>
+        <w:keepNext/>
+        <w:pageBreakBefore/>
       </w:pPr>
       <w:r>
-        <w:rPr>
-          <w:rFonts w:ascii="Consolas" w:hAnsi="Consolas"/>
-          <w:b w:val="0"/>
-          <w:sz w:val="16"/>
-        </w:rPr>
-        <w:t>uv run --frozen python scripts/​replay_​final.py --source evidence/​final-f5 --output evidence/​final-offline-check --cases D:​/​fintechathon/​blind-frozen</w:t>
+        <w:t>Verify actual effects rather than persuasive output</w:t>
+      </w:r>
+    </w:p>
+    <w:p>
+      <w:pPr>
+        <w:keepNext/>
+        <w:spacing w:before="80" w:after="80"/>
+        <w:jc w:val="center"/>
+      </w:pPr>
+      <w:r>
+        <w:drawing>
+          <wp:inline xmlns:a="http://schemas.openxmlformats.org/drawingml/2006/main" xmlns:pic="http://schemas.openxmlformats.org/drawingml/2006/picture">
+            <wp:extent cx="6236208" cy="3507867"/>
+            <wp:docPr id="4" name="Picture 4" descr="F5 reported security observations and upper bounds. Modes and denominators remain separate; no zero result is generalized to all attacks."/>
+            <wp:cNvGraphicFramePr>
+              <a:graphicFrameLocks noChangeAspect="1"/>
+            </wp:cNvGraphicFramePr>
+            <a:graphic>
+              <a:graphicData uri="http://schemas.openxmlformats.org/drawingml/2006/picture">
+                <pic:pic>
+                  <pic:nvPicPr>
+                    <pic:cNvPr id="0" name="security-results.png"/>
+                    <pic:cNvPicPr/>
+                  </pic:nvPicPr>
+                  <pic:blipFill>
+                    <a:blip r:embed="rId19"/>
+                    <a:stretch>
+                      <a:fillRect/>
+                    </a:stretch>
+                  </pic:blipFill>
+                  <pic:spPr>
+                    <a:xfrm>
+                      <a:off x="0" y="0"/>
+                      <a:ext cx="6236208" cy="3507867"/>
+                    </a:xfrm>
+                    <a:prstGeom prst="rect"/>
+                  </pic:spPr>
+                </pic:pic>
+              </a:graphicData>
+            </a:graphic>
+          </wp:inline>
+        </w:drawing>
+      </w:r>
+    </w:p>
+    <w:p>
+      <w:pPr>
+        <w:pStyle w:val="Caption"/>
+        <w:spacing w:after="200"/>
+      </w:pPr>
+      <w:r>
+        <w:t>F5 reported security observations and upper bounds. Modes and denominators remain separate; no zero result is generalized to all attacks.</w:t>
       </w:r>
     </w:p>
     <w:p>
       <w:r>
-        <w:rPr>
-          <w:b w:val="0"/>
-        </w:rPr>
-        <w:t xml:space="preserve">Its </w:t>
+        <w:t xml:space="preserve">The retained F5 report gives live-recorded M7 forbidden effects of </w:t>
       </w:r>
       <w:r>
         <w:rPr>
-          <w:rFonts w:ascii="Consolas" w:hAnsi="Consolas"/>
-          <w:b w:val="0"/>
-          <w:sz w:val="16"/>
+          <w:b/>
         </w:rPr>
-        <w:t>replay-summary.json</w:t>
+        <w:t>0/24</w:t>
+      </w:r>
+      <w:r>
+        <w:t xml:space="preserve">, with </w:t>
       </w:r>
       <w:r>
         <w:rPr>
-          <w:b w:val="0"/>
+          <w:b/>
         </w:rPr>
-        <w:t xml:space="preserve"> reports observation equality separately from task success and actual API calls. Missing source records or a reused output directory are errors. No API key is required.</w:t>
+        <w:t>0/6</w:t>
+      </w:r>
+      <w:r>
+        <w:t xml:space="preserve"> in each named attack family, and frozen blind effects of </w:t>
+      </w:r>
+      <w:r>
+        <w:rPr>
+          <w:b/>
+        </w:rPr>
+        <w:t>0/16</w:t>
+      </w:r>
+      <w:r>
+        <w:t xml:space="preserve">. It separately reports scripted Byzantine effects of </w:t>
+      </w:r>
+      <w:r>
+        <w:rPr>
+          <w:b/>
+        </w:rPr>
+        <w:t>0/40</w:t>
+      </w:r>
+      <w:r>
+        <w:t xml:space="preserve"> and differential disagreements of </w:t>
+      </w:r>
+      <w:r>
+        <w:rPr>
+          <w:b/>
+        </w:rPr>
+        <w:t>0/1000</w:t>
+      </w:r>
+      <w:r>
+        <w:t xml:space="preserve">. Descriptive approximate 95% upper bounds are </w:t>
+      </w:r>
+      <w:r>
+        <w:rPr>
+          <w:b/>
+        </w:rPr>
+        <w:t>12.5000%</w:t>
+      </w:r>
+      <w:r>
+        <w:t xml:space="preserve">, </w:t>
+      </w:r>
+      <w:r>
+        <w:rPr>
+          <w:b/>
+        </w:rPr>
+        <w:t>50.0000%</w:t>
+      </w:r>
+      <w:r>
+        <w:t xml:space="preserve"> per M7 family, </w:t>
+      </w:r>
+      <w:r>
+        <w:rPr>
+          <w:b/>
+        </w:rPr>
+        <w:t>18.7500%</w:t>
+      </w:r>
+      <w:r>
+        <w:t xml:space="preserve">, </w:t>
+      </w:r>
+      <w:r>
+        <w:rPr>
+          <w:b/>
+        </w:rPr>
+        <w:t>7.5000%</w:t>
+      </w:r>
+      <w:r>
+        <w:t xml:space="preserve"> and </w:t>
+      </w:r>
+      <w:r>
+        <w:rPr>
+          <w:b/>
+        </w:rPr>
+        <w:t>0.3000%</w:t>
+      </w:r>
+      <w:r>
+        <w:t>, respectively. The security assessment explains exposure and independence limits.</w:t>
       </w:r>
     </w:p>
     <w:p>
       <w:r>
-        <w:rPr>
-          <w:b w:val="0"/>
-        </w:rPr>
-        <w:t>Strict evaluation disables transport and loads no credential file. Replaying a different profile or absent cache must fail rather than fall back. Compare normalized case observations and actual receipt effects; the existence of replay files alone is insufficient.</w:t>
+        <w:t>For an individual trace, compare the signed request and canonical card with the exact bank receipt and final holdings. Verify parent/child binding, per-leg authority and current trusted inputs. Check rejection and unknown-state records as well as successful purchases. A narrative claim of completion is not a receipt.</w:t>
       </w:r>
     </w:p>
     <w:p>
       <w:r>
-        <w:rPr>
-          <w:b w:val="0"/>
-        </w:rPr>
+        <w:t>Runtime checks verify approval signatures, but compact wealth exports retain only token identifiers and hashes. Independent reconstruction of the complete token signature check requires the appropriate full authorized export.</w:t>
+      </w:r>
+    </w:p>
+    <w:p>
+      <w:r>
         <w:t xml:space="preserve">Use </w:t>
       </w:r>
       <w:r>
         <w:rPr>
           <w:rFonts w:ascii="Consolas" w:hAnsi="Consolas"/>
-          <w:b w:val="0"/>
-          <w:sz w:val="16"/>
+          <w:sz w:val="18"/>
         </w:rPr>
         <w:t>corridor verify-log --help</w:t>
       </w:r>
       <w:r>
-        <w:rPr>
-          <w:b w:val="0"/>
-        </w:rPr>
-        <w:t xml:space="preserve"> for the exact path/head/checkpoint options for a selected exported audit. Compare all bundle files with the retained manifest and scan the actual archive before release. An operator must preserve the exported archive and submission receipt when external upload is eventually performed.</w:t>
+        <w:t xml:space="preserve"> for the path, head and checkpoint options. Compare exported files against their retained manifest, and inspect the actual archive for sensitive material before any external release. Keep failures and prior legal effects visible; do not zero-fill missing evidence or relabel protocol gaps as monetary loss.</w:t>
       </w:r>
     </w:p>
     <w:p>
       <w:r>
+        <w:t xml:space="preserve">Current validation and document page counts are recorded in </w:t>
+      </w:r>
+      <w:hyperlink r:id="rId20">
+        <w:r>
+          <w:rPr>
+            <w:color w:val="315FD8"/>
+          </w:rPr>
+          <w:t>artifact validation</w:t>
+        </w:r>
+      </w:hyperlink>
+      <w:r>
+        <w:t xml:space="preserve">. Full source-level rules remain in </w:t>
+      </w:r>
+      <w:hyperlink r:id="rId21">
+        <w:r>
+          <w:rPr>
+            <w:color w:val="315FD8"/>
+          </w:rPr>
+          <w:t>rule-matrix.md</w:t>
+        </w:r>
+      </w:hyperlink>
+      <w:r>
+        <w:t xml:space="preserve">. Repository: </w:t>
+      </w:r>
+      <w:hyperlink r:id="rId22">
+        <w:r>
+          <w:rPr>
+            <w:color w:val="315FD8"/>
+          </w:rPr>
+          <w:t>Corridor Wealth source</w:t>
+        </w:r>
+      </w:hyperlink>
+      <w:r>
+        <w:t xml:space="preserve">. This synthetic prototype is </w:t>
+      </w:r>
+      <w:r>
         <w:rPr>
-          <w:b w:val="0"/>
+          <w:b/>
         </w:rPr>
-        <w:t>The wealth workflow export retains approval token identifiers/hashes rather than the nonce-bearing complete token. Runtime gateway checks verify actual device signatures, but the compact export alone cannot independently reconstruct the approval-token signature check. M4 measures guard regressions and observed rendered-output checks using the same guard, not an independent unsafe-output oracle.</w:t>
+        <w:t>not investment advice</w:t>
+      </w:r>
+      <w:r>
+        <w:t>.</w:t>
       </w:r>
     </w:p>
     <w:sectPr>
@@ -1987,10 +3543,11 @@
     </w:pPr>
     <w:r>
       <w:rPr>
+        <w:rFonts w:ascii="Arial" w:hAnsi="Arial"/>
         <w:color w:val="616C7F"/>
         <w:sz w:val="16"/>
       </w:rPr>
-      <w:t>Corridor Wealth | International AI Track Topic B | Synthetic prototype</w:t>
+      <w:t>Corridor Wealth  |  Topic B  |  Synthetic data  |  Not investment advice</w:t>
     </w:r>
   </w:p>
 </w:ftr>
@@ -2360,12 +3917,12 @@
     <w:qFormat/>
     <w:rsid w:val="00FC693F"/>
     <w:pPr>
-      <w:spacing w:after="120" w:line="252" w:lineRule="auto"/>
+      <w:spacing w:after="140" w:line="264" w:lineRule="auto"/>
     </w:pPr>
     <w:rPr>
-      <w:rFonts w:ascii="Calibri" w:hAnsi="Calibri" w:eastAsia="Arial Unicode MS"/>
+      <w:rFonts w:ascii="Arial" w:hAnsi="Arial" w:eastAsia="Arial Unicode MS"/>
       <w:color w:val="17213A"/>
-      <w:sz w:val="20"/>
+      <w:sz w:val="21"/>
     </w:rPr>
   </w:style>
   <w:style w:type="paragraph" w:styleId="Header">
@@ -2423,15 +3980,15 @@
     <w:pPr>
       <w:keepNext/>
       <w:keepLines/>
-      <w:spacing w:before="240" w:after="120"/>
+      <w:spacing w:before="200" w:after="140"/>
       <w:outlineLvl w:val="0"/>
     </w:pPr>
     <w:rPr>
-      <w:rFonts w:asciiTheme="majorHAnsi" w:eastAsiaTheme="majorEastAsia" w:hAnsiTheme="majorHAnsi" w:cstheme="majorBidi" w:ascii="Calibri" w:hAnsi="Calibri" w:eastAsia="Arial Unicode MS"/>
+      <w:rFonts w:asciiTheme="majorHAnsi" w:eastAsiaTheme="majorEastAsia" w:hAnsiTheme="majorHAnsi" w:cstheme="majorBidi" w:ascii="Arial" w:hAnsi="Arial" w:eastAsia="Arial Unicode MS"/>
       <w:b/>
       <w:bCs/>
-      <w:color w:val="000000"/>
-      <w:sz w:val="36"/>
+      <w:color w:val="315FD8"/>
+      <w:sz w:val="30"/>
       <w:szCs w:val="28"/>
     </w:rPr>
   </w:style>
@@ -2447,15 +4004,15 @@
     <w:pPr>
       <w:keepNext/>
       <w:keepLines/>
-      <w:spacing w:before="240" w:after="120"/>
+      <w:spacing w:before="200" w:after="140"/>
       <w:outlineLvl w:val="1"/>
     </w:pPr>
     <w:rPr>
-      <w:rFonts w:asciiTheme="majorHAnsi" w:eastAsiaTheme="majorEastAsia" w:hAnsiTheme="majorHAnsi" w:cstheme="majorBidi" w:ascii="Calibri" w:hAnsi="Calibri" w:eastAsia="Arial Unicode MS"/>
+      <w:rFonts w:asciiTheme="majorHAnsi" w:eastAsiaTheme="majorEastAsia" w:hAnsiTheme="majorHAnsi" w:cstheme="majorBidi" w:ascii="Arial" w:hAnsi="Arial" w:eastAsia="Arial Unicode MS"/>
       <w:b/>
       <w:bCs/>
-      <w:color w:val="000000"/>
-      <w:sz w:val="24"/>
+      <w:color w:val="315FD8"/>
+      <w:sz w:val="25"/>
       <w:szCs w:val="26"/>
     </w:rPr>
   </w:style>
@@ -2471,15 +4028,15 @@
     <w:pPr>
       <w:keepNext/>
       <w:keepLines/>
-      <w:spacing w:before="200" w:after="0"/>
+      <w:spacing w:before="200" w:after="140"/>
       <w:outlineLvl w:val="2"/>
     </w:pPr>
     <w:rPr>
-      <w:rFonts w:asciiTheme="majorHAnsi" w:eastAsiaTheme="majorEastAsia" w:hAnsiTheme="majorHAnsi" w:cstheme="majorBidi" w:ascii="Calibri" w:hAnsi="Calibri"/>
+      <w:rFonts w:asciiTheme="majorHAnsi" w:eastAsiaTheme="majorEastAsia" w:hAnsiTheme="majorHAnsi" w:cstheme="majorBidi" w:ascii="Arial" w:hAnsi="Arial"/>
       <w:b/>
       <w:bCs/>
-      <w:color w:val="000000"/>
-      <w:sz w:val="22"/>
+      <w:color w:val="4F81BD" w:themeColor="accent1"/>
+      <w:sz w:val="23"/>
     </w:rPr>
   </w:style>
   <w:style w:type="paragraph" w:styleId="Heading4">
@@ -2710,16 +4267,15 @@
     <w:qFormat/>
     <w:rsid w:val="00FC693F"/>
     <w:pPr>
-      <w:keepNext/>
       <w:spacing w:after="300" w:line="240" w:lineRule="auto"/>
       <w:contextualSpacing/>
     </w:pPr>
     <w:rPr>
-      <w:rFonts w:asciiTheme="majorHAnsi" w:eastAsiaTheme="majorEastAsia" w:hAnsiTheme="majorHAnsi" w:cstheme="majorBidi" w:ascii="Calibri" w:hAnsi="Calibri"/>
-      <w:color w:val="000000"/>
+      <w:rFonts w:asciiTheme="majorHAnsi" w:eastAsiaTheme="majorEastAsia" w:hAnsiTheme="majorHAnsi" w:cstheme="majorBidi"/>
+      <w:color w:val="17365D" w:themeColor="text2" w:themeShade="BF"/>
       <w:spacing w:val="5"/>
       <w:kern w:val="28"/>
-      <w:sz w:val="50"/>
+      <w:sz w:val="52"/>
       <w:szCs w:val="52"/>
     </w:rPr>
   </w:style>
@@ -3157,10 +4713,12 @@
       <w:spacing w:line="240" w:lineRule="auto"/>
     </w:pPr>
     <w:rPr>
+      <w:rFonts w:ascii="Arial" w:hAnsi="Arial"/>
       <w:b/>
       <w:bCs/>
-      <w:color w:val="4F81BD" w:themeColor="accent1"/>
-      <w:sz w:val="18"/>
+      <w:i w:val="0"/>
+      <w:color w:val="616C7F"/>
+      <w:sz w:val="17"/>
       <w:szCs w:val="18"/>
     </w:rPr>
   </w:style>

</xml_diff>